<commit_message>
cambio final al word.
</commit_message>
<xml_diff>
--- a/Madrid_Darien_CIB302_Semana4.docx
+++ b/Madrid_Darien_CIB302_Semana4.docx
@@ -369,7 +369,11 @@
     <w:sdt>
       <w:sdtPr>
         <w:rPr>
-          <w:lang w:val="es-MX"/>
+          <w:rFonts w:asciiTheme="minorHAnsi" w:eastAsiaTheme="minorHAnsi" w:hAnsiTheme="minorHAnsi" w:cstheme="minorBidi"/>
+          <w:color w:val="auto"/>
+          <w:sz w:val="24"/>
+          <w:szCs w:val="24"/>
+          <w:lang w:val="es-MX" w:eastAsia="en-US"/>
         </w:rPr>
         <w:id w:val="-2114115367"/>
         <w:docPartObj>
@@ -379,13 +383,8 @@
       </w:sdtPr>
       <w:sdtEndPr>
         <w:rPr>
-          <w:rFonts w:asciiTheme="minorHAnsi" w:eastAsiaTheme="minorHAnsi" w:hAnsiTheme="minorHAnsi" w:cstheme="minorBidi"/>
           <w:b/>
           <w:bCs/>
-          <w:color w:val="auto"/>
-          <w:sz w:val="24"/>
-          <w:szCs w:val="24"/>
-          <w:lang w:eastAsia="en-US"/>
         </w:rPr>
       </w:sdtEndPr>
       <w:sdtContent>
@@ -421,7 +420,11 @@
               <w:tab w:val="right" w:leader="dot" w:pos="8828"/>
             </w:tabs>
             <w:rPr>
+              <w:rFonts w:eastAsiaTheme="minorEastAsia"/>
               <w:noProof/>
+              <w:kern w:val="2"/>
+              <w:lang w:val="es-CL" w:eastAsia="es-CL"/>
+              <w14:ligatures w14:val="standardContextual"/>
             </w:rPr>
           </w:pPr>
           <w:r>
@@ -433,7 +436,7 @@
           <w:r>
             <w:fldChar w:fldCharType="separate"/>
           </w:r>
-          <w:hyperlink w:anchor="_Toc227088547" w:history="1">
+          <w:hyperlink w:anchor="_Toc227094316" w:history="1">
             <w:r>
               <w:rPr>
                 <w:rStyle w:val="Hipervnculo"/>
@@ -462,7 +465,7 @@
                 <w:noProof/>
                 <w:webHidden/>
               </w:rPr>
-              <w:instrText xml:space="preserve"> PAGEREF _Toc227088547 \h </w:instrText>
+              <w:instrText xml:space="preserve"> PAGEREF _Toc227094316 \h </w:instrText>
             </w:r>
             <w:r>
               <w:rPr>
@@ -500,10 +503,14 @@
               <w:tab w:val="right" w:leader="dot" w:pos="8828"/>
             </w:tabs>
             <w:rPr>
+              <w:rFonts w:eastAsiaTheme="minorEastAsia"/>
               <w:noProof/>
+              <w:kern w:val="2"/>
+              <w:lang w:val="es-CL" w:eastAsia="es-CL"/>
+              <w14:ligatures w14:val="standardContextual"/>
             </w:rPr>
           </w:pPr>
-          <w:hyperlink w:anchor="_Toc227088548" w:history="1">
+          <w:hyperlink w:anchor="_Toc227094317" w:history="1">
             <w:r>
               <w:rPr>
                 <w:rStyle w:val="Hipervnculo"/>
@@ -532,7 +539,7 @@
                 <w:noProof/>
                 <w:webHidden/>
               </w:rPr>
-              <w:instrText xml:space="preserve"> PAGEREF _Toc227088548 \h </w:instrText>
+              <w:instrText xml:space="preserve"> PAGEREF _Toc227094317 \h </w:instrText>
             </w:r>
             <w:r>
               <w:rPr>
@@ -570,10 +577,14 @@
               <w:tab w:val="right" w:leader="dot" w:pos="8828"/>
             </w:tabs>
             <w:rPr>
+              <w:rFonts w:eastAsiaTheme="minorEastAsia"/>
               <w:noProof/>
+              <w:kern w:val="2"/>
+              <w:lang w:val="es-CL" w:eastAsia="es-CL"/>
+              <w14:ligatures w14:val="standardContextual"/>
             </w:rPr>
           </w:pPr>
-          <w:hyperlink w:anchor="_Toc227088549" w:history="1">
+          <w:hyperlink w:anchor="_Toc227094318" w:history="1">
             <w:r>
               <w:rPr>
                 <w:rStyle w:val="Hipervnculo"/>
@@ -602,7 +613,7 @@
                 <w:noProof/>
                 <w:webHidden/>
               </w:rPr>
-              <w:instrText xml:space="preserve"> PAGEREF _Toc227088549 \h </w:instrText>
+              <w:instrText xml:space="preserve"> PAGEREF _Toc227094318 \h </w:instrText>
             </w:r>
             <w:r>
               <w:rPr>
@@ -640,10 +651,14 @@
               <w:tab w:val="right" w:leader="dot" w:pos="8828"/>
             </w:tabs>
             <w:rPr>
+              <w:rFonts w:eastAsiaTheme="minorEastAsia"/>
               <w:noProof/>
+              <w:kern w:val="2"/>
+              <w:lang w:val="es-CL" w:eastAsia="es-CL"/>
+              <w14:ligatures w14:val="standardContextual"/>
             </w:rPr>
           </w:pPr>
-          <w:hyperlink w:anchor="_Toc227088550" w:history="1">
+          <w:hyperlink w:anchor="_Toc227094319" w:history="1">
             <w:r>
               <w:rPr>
                 <w:rStyle w:val="Hipervnculo"/>
@@ -672,7 +687,7 @@
                 <w:noProof/>
                 <w:webHidden/>
               </w:rPr>
-              <w:instrText xml:space="preserve"> PAGEREF _Toc227088550 \h </w:instrText>
+              <w:instrText xml:space="preserve"> PAGEREF _Toc227094319 \h </w:instrText>
             </w:r>
             <w:r>
               <w:rPr>
@@ -710,10 +725,14 @@
               <w:tab w:val="right" w:leader="dot" w:pos="8828"/>
             </w:tabs>
             <w:rPr>
+              <w:rFonts w:eastAsiaTheme="minorEastAsia"/>
               <w:noProof/>
+              <w:kern w:val="2"/>
+              <w:lang w:val="es-CL" w:eastAsia="es-CL"/>
+              <w14:ligatures w14:val="standardContextual"/>
             </w:rPr>
           </w:pPr>
-          <w:hyperlink w:anchor="_Toc227088551" w:history="1">
+          <w:hyperlink w:anchor="_Toc227094320" w:history="1">
             <w:r>
               <w:rPr>
                 <w:rStyle w:val="Hipervnculo"/>
@@ -742,7 +761,7 @@
                 <w:noProof/>
                 <w:webHidden/>
               </w:rPr>
-              <w:instrText xml:space="preserve"> PAGEREF _Toc227088551 \h </w:instrText>
+              <w:instrText xml:space="preserve"> PAGEREF _Toc227094320 \h </w:instrText>
             </w:r>
             <w:r>
               <w:rPr>
@@ -780,10 +799,14 @@
               <w:tab w:val="right" w:leader="dot" w:pos="8828"/>
             </w:tabs>
             <w:rPr>
+              <w:rFonts w:eastAsiaTheme="minorEastAsia"/>
               <w:noProof/>
+              <w:kern w:val="2"/>
+              <w:lang w:val="es-CL" w:eastAsia="es-CL"/>
+              <w14:ligatures w14:val="standardContextual"/>
             </w:rPr>
           </w:pPr>
-          <w:hyperlink w:anchor="_Toc227088552" w:history="1">
+          <w:hyperlink w:anchor="_Toc227094321" w:history="1">
             <w:r>
               <w:rPr>
                 <w:rStyle w:val="Hipervnculo"/>
@@ -812,7 +835,7 @@
                 <w:noProof/>
                 <w:webHidden/>
               </w:rPr>
-              <w:instrText xml:space="preserve"> PAGEREF _Toc227088552 \h </w:instrText>
+              <w:instrText xml:space="preserve"> PAGEREF _Toc227094321 \h </w:instrText>
             </w:r>
             <w:r>
               <w:rPr>
@@ -850,13 +873,19 @@
               <w:tab w:val="right" w:leader="dot" w:pos="8828"/>
             </w:tabs>
             <w:rPr>
+              <w:rFonts w:eastAsiaTheme="minorEastAsia"/>
               <w:noProof/>
+              <w:kern w:val="2"/>
+              <w:lang w:val="es-CL" w:eastAsia="es-CL"/>
+              <w14:ligatures w14:val="standardContextual"/>
             </w:rPr>
           </w:pPr>
-          <w:hyperlink w:anchor="_Toc227088553" w:history="1">
+          <w:hyperlink w:anchor="_Toc227094322" w:history="1">
             <w:r>
               <w:rPr>
                 <w:rStyle w:val="Hipervnculo"/>
+                <w:b/>
+                <w:bCs/>
                 <w:noProof/>
               </w:rPr>
               <w:t>CIERRE DE SESION</w:t>
@@ -880,7 +909,7 @@
                 <w:noProof/>
                 <w:webHidden/>
               </w:rPr>
-              <w:instrText xml:space="preserve"> PAGEREF _Toc227088553 \h </w:instrText>
+              <w:instrText xml:space="preserve"> PAGEREF _Toc227094322 \h </w:instrText>
             </w:r>
             <w:r>
               <w:rPr>
@@ -918,13 +947,19 @@
               <w:tab w:val="right" w:leader="dot" w:pos="8828"/>
             </w:tabs>
             <w:rPr>
+              <w:rFonts w:eastAsiaTheme="minorEastAsia"/>
               <w:noProof/>
+              <w:kern w:val="2"/>
+              <w:lang w:val="es-CL" w:eastAsia="es-CL"/>
+              <w14:ligatures w14:val="standardContextual"/>
             </w:rPr>
           </w:pPr>
-          <w:hyperlink w:anchor="_Toc227088554" w:history="1">
+          <w:hyperlink w:anchor="_Toc227094323" w:history="1">
             <w:r>
               <w:rPr>
                 <w:rStyle w:val="Hipervnculo"/>
+                <w:b/>
+                <w:bCs/>
                 <w:noProof/>
               </w:rPr>
               <w:t>PRUEBAS DEL SISTEMA</w:t>
@@ -948,7 +983,7 @@
                 <w:noProof/>
                 <w:webHidden/>
               </w:rPr>
-              <w:instrText xml:space="preserve"> PAGEREF _Toc227088554 \h </w:instrText>
+              <w:instrText xml:space="preserve"> PAGEREF _Toc227094323 \h </w:instrText>
             </w:r>
             <w:r>
               <w:rPr>
@@ -986,13 +1021,19 @@
               <w:tab w:val="right" w:leader="dot" w:pos="8828"/>
             </w:tabs>
             <w:rPr>
+              <w:rFonts w:eastAsiaTheme="minorEastAsia"/>
               <w:noProof/>
+              <w:kern w:val="2"/>
+              <w:lang w:val="es-CL" w:eastAsia="es-CL"/>
+              <w14:ligatures w14:val="standardContextual"/>
             </w:rPr>
           </w:pPr>
-          <w:hyperlink w:anchor="_Toc227088555" w:history="1">
+          <w:hyperlink w:anchor="_Toc227094324" w:history="1">
             <w:r>
               <w:rPr>
                 <w:rStyle w:val="Hipervnculo"/>
+                <w:b/>
+                <w:bCs/>
                 <w:noProof/>
               </w:rPr>
               <w:t>TRABAJO COLABORATIVO CON GITHUB (AMBOS)</w:t>
@@ -1016,7 +1057,7 @@
                 <w:noProof/>
                 <w:webHidden/>
               </w:rPr>
-              <w:instrText xml:space="preserve"> PAGEREF _Toc227088555 \h </w:instrText>
+              <w:instrText xml:space="preserve"> PAGEREF _Toc227094324 \h </w:instrText>
             </w:r>
             <w:r>
               <w:rPr>
@@ -1036,7 +1077,7 @@
                 <w:noProof/>
                 <w:webHidden/>
               </w:rPr>
-              <w:t>14</w:t>
+              <w:t>17</w:t>
             </w:r>
             <w:r>
               <w:rPr>
@@ -1054,13 +1095,19 @@
               <w:tab w:val="right" w:leader="dot" w:pos="8828"/>
             </w:tabs>
             <w:rPr>
+              <w:rFonts w:eastAsiaTheme="minorEastAsia"/>
               <w:noProof/>
+              <w:kern w:val="2"/>
+              <w:lang w:val="es-CL" w:eastAsia="es-CL"/>
+              <w14:ligatures w14:val="standardContextual"/>
             </w:rPr>
           </w:pPr>
-          <w:hyperlink w:anchor="_Toc227088556" w:history="1">
+          <w:hyperlink w:anchor="_Toc227094325" w:history="1">
             <w:r>
               <w:rPr>
                 <w:rStyle w:val="Hipervnculo"/>
+                <w:b/>
+                <w:bCs/>
                 <w:noProof/>
               </w:rPr>
               <w:t>CONCLUSIÓN</w:t>
@@ -1084,7 +1131,7 @@
                 <w:noProof/>
                 <w:webHidden/>
               </w:rPr>
-              <w:instrText xml:space="preserve"> PAGEREF _Toc227088556 \h </w:instrText>
+              <w:instrText xml:space="preserve"> PAGEREF _Toc227094325 \h </w:instrText>
             </w:r>
             <w:r>
               <w:rPr>
@@ -1104,7 +1151,7 @@
                 <w:noProof/>
                 <w:webHidden/>
               </w:rPr>
-              <w:t>15</w:t>
+              <w:t>18</w:t>
             </w:r>
             <w:r>
               <w:rPr>
@@ -1160,7 +1207,7 @@
           <w:bCs/>
         </w:rPr>
       </w:pPr>
-      <w:bookmarkStart w:id="0" w:name="_Toc227088547"/>
+      <w:bookmarkStart w:id="0" w:name="_Toc227094316"/>
       <w:r>
         <w:rPr>
           <w:b/>
@@ -1529,7 +1576,7 @@
           <w:bCs/>
         </w:rPr>
       </w:pPr>
-      <w:bookmarkStart w:id="1" w:name="_Toc227088548"/>
+      <w:bookmarkStart w:id="1" w:name="_Toc227094317"/>
       <w:r>
         <w:rPr>
           <w:b/>
@@ -1926,7 +1973,7 @@
           <w:bCs/>
         </w:rPr>
       </w:pPr>
-      <w:bookmarkStart w:id="2" w:name="_Toc227088549"/>
+      <w:bookmarkStart w:id="2" w:name="_Toc227094318"/>
       <w:r>
         <w:rPr>
           <w:b/>
@@ -2231,7 +2278,7 @@
           <w:bCs/>
         </w:rPr>
       </w:pPr>
-      <w:bookmarkStart w:id="3" w:name="_Toc227088550"/>
+      <w:bookmarkStart w:id="3" w:name="_Toc227094319"/>
       <w:r>
         <w:rPr>
           <w:b/>
@@ -2604,7 +2651,7 @@
           <w:bCs/>
         </w:rPr>
       </w:pPr>
-      <w:bookmarkStart w:id="4" w:name="_Toc227088551"/>
+      <w:bookmarkStart w:id="4" w:name="_Toc227094320"/>
       <w:r>
         <w:rPr>
           <w:rFonts w:eastAsiaTheme="minorEastAsia"/>
@@ -3074,7 +3121,7 @@
           <w:bCs/>
         </w:rPr>
       </w:pPr>
-      <w:bookmarkStart w:id="5" w:name="_Toc227088552"/>
+      <w:bookmarkStart w:id="5" w:name="_Toc227094321"/>
       <w:r>
         <w:rPr>
           <w:b/>
@@ -6319,9 +6366,17 @@
     <w:p>
       <w:pPr>
         <w:pStyle w:val="Ttulo1"/>
-      </w:pPr>
-      <w:bookmarkStart w:id="6" w:name="_Toc227088553"/>
-      <w:r>
+        <w:rPr>
+          <w:b/>
+          <w:bCs/>
+        </w:rPr>
+      </w:pPr>
+      <w:bookmarkStart w:id="6" w:name="_Toc227094322"/>
+      <w:r>
+        <w:rPr>
+          <w:b/>
+          <w:bCs/>
+        </w:rPr>
         <w:lastRenderedPageBreak/>
         <w:t>CIERRE DE SESION</w:t>
       </w:r>
@@ -6746,7 +6801,13 @@
         <w:jc w:val="both"/>
       </w:pPr>
       <w:r>
-        <w:t>En el cuadro N°1, lo que se hace es decirle al navegador/cliente que elimine la cookie llamada “token”, en esta “cookie” esta guardado el JWT cuando se realizo el “</w:t>
+        <w:t xml:space="preserve">En el cuadro N°1, lo que se hace es decirle al navegador/cliente que elimine la cookie llamada “token”, en esta “cookie” esta guardado el JWT cuando se </w:t>
+      </w:r>
+      <w:r>
+        <w:t>realizó</w:t>
+      </w:r>
+      <w:r>
+        <w:t xml:space="preserve"> el “</w:t>
       </w:r>
       <w:proofErr w:type="spellStart"/>
       <w:r>
@@ -6765,11 +6826,9 @@
       <w:r>
         <w:t xml:space="preserve">La </w:t>
       </w:r>
-      <w:proofErr w:type="spellStart"/>
-      <w:r>
-        <w:t>ultima</w:t>
-      </w:r>
-      <w:proofErr w:type="spellEnd"/>
+      <w:r>
+        <w:t>última</w:t>
+      </w:r>
       <w:r>
         <w:t xml:space="preserve"> línea es cuando nos encontramos en el </w:t>
       </w:r>
@@ -6793,9 +6852,17 @@
     <w:p>
       <w:pPr>
         <w:pStyle w:val="Ttulo1"/>
-      </w:pPr>
-      <w:bookmarkStart w:id="7" w:name="_Toc227088554"/>
-      <w:r>
+        <w:rPr>
+          <w:b/>
+          <w:bCs/>
+        </w:rPr>
+      </w:pPr>
+      <w:bookmarkStart w:id="7" w:name="_Toc227094323"/>
+      <w:r>
+        <w:rPr>
+          <w:b/>
+          <w:bCs/>
+        </w:rPr>
         <w:lastRenderedPageBreak/>
         <w:t>PRUEBAS DEL SISTEMA</w:t>
       </w:r>
@@ -6808,6 +6875,7 @@
     </w:p>
     <w:p>
       <w:pPr>
+        <w:spacing w:line="360" w:lineRule="auto"/>
         <w:jc w:val="both"/>
       </w:pPr>
       <w:r>
@@ -6848,6 +6916,9 @@
         <w:jc w:val="both"/>
       </w:pPr>
       <w:r>
+        <w:rPr>
+          <w:noProof/>
+        </w:rPr>
         <w:drawing>
           <wp:inline distT="0" distB="0" distL="0" distR="0" wp14:anchorId="02FCBE9D" wp14:editId="3A2F6F6B">
             <wp:extent cx="5612130" cy="4182110"/>
@@ -6917,16 +6988,16 @@
     </w:p>
     <w:p>
       <w:pPr>
+        <w:spacing w:line="360" w:lineRule="auto"/>
         <w:jc w:val="both"/>
       </w:pPr>
       <w:r>
+        <w:lastRenderedPageBreak/>
         <w:t xml:space="preserve">Para realizar las pruebas, se </w:t>
       </w:r>
-      <w:proofErr w:type="spellStart"/>
-      <w:r>
-        <w:t>descargo</w:t>
-      </w:r>
-      <w:proofErr w:type="spellEnd"/>
+      <w:r>
+        <w:t>descargó</w:t>
+      </w:r>
       <w:r>
         <w:t xml:space="preserve"> también “</w:t>
       </w:r>
@@ -6938,11 +7009,9 @@
       <w:r>
         <w:t xml:space="preserve">” para simular la </w:t>
       </w:r>
-      <w:proofErr w:type="spellStart"/>
-      <w:r>
-        <w:t>pagina</w:t>
-      </w:r>
-      <w:proofErr w:type="spellEnd"/>
+      <w:r>
+        <w:t>página</w:t>
+      </w:r>
       <w:r>
         <w:t>, ya con esto debemos abrir una terminal e iniciar “</w:t>
       </w:r>
@@ -6966,6 +7035,9 @@
         <w:jc w:val="both"/>
       </w:pPr>
       <w:r>
+        <w:rPr>
+          <w:noProof/>
+        </w:rPr>
         <w:drawing>
           <wp:inline distT="0" distB="0" distL="0" distR="0" wp14:anchorId="30FEB3A2" wp14:editId="6E78DBFA">
             <wp:extent cx="5560484" cy="810293"/>
@@ -7066,13 +7138,24 @@
         <w:jc w:val="both"/>
       </w:pPr>
       <w:r>
-        <w:t>Con el servidor corriendo y ya habiendo descargo el programa Postman,</w:t>
+        <w:t>Con el servidor corriendo y ya habiendo descargo el programa Postman</w:t>
       </w:r>
     </w:p>
     <w:p>
       <w:pPr>
         <w:jc w:val="both"/>
-      </w:pPr>
+        <w:rPr>
+          <w:b/>
+          <w:bCs/>
+        </w:rPr>
+      </w:pPr>
+      <w:r>
+        <w:rPr>
+          <w:b/>
+          <w:bCs/>
+        </w:rPr>
+        <w:t>1ra. Prueba</w:t>
+      </w:r>
     </w:p>
     <w:p>
       <w:pPr>
@@ -7088,16 +7171,201 @@
         <mc:AlternateContent>
           <mc:Choice Requires="wps">
             <w:drawing>
-              <wp:anchor distT="0" distB="0" distL="114300" distR="114300" simplePos="0" relativeHeight="251681792" behindDoc="0" locked="0" layoutInCell="1" allowOverlap="1" wp14:anchorId="17FB7327" wp14:editId="482CB955">
+              <wp:anchor distT="0" distB="0" distL="114300" distR="114300" simplePos="0" relativeHeight="251679744" behindDoc="0" locked="0" layoutInCell="1" allowOverlap="1" wp14:anchorId="020BEC85" wp14:editId="26368DB6">
                 <wp:simplePos x="0" y="0"/>
                 <wp:positionH relativeFrom="margin">
-                  <wp:posOffset>661035</wp:posOffset>
+                  <wp:posOffset>1270635</wp:posOffset>
                 </wp:positionH>
                 <wp:positionV relativeFrom="paragraph">
-                  <wp:posOffset>1864995</wp:posOffset>
+                  <wp:posOffset>1689735</wp:posOffset>
                 </wp:positionV>
-                <wp:extent cx="991870" cy="402590"/>
-                <wp:effectExtent l="19050" t="19050" r="17780" b="16510"/>
+                <wp:extent cx="1687830" cy="689610"/>
+                <wp:effectExtent l="19050" t="19050" r="26670" b="15240"/>
+                <wp:wrapNone/>
+                <wp:docPr id="540692441" name="Rectángulo 1"/>
+                <wp:cNvGraphicFramePr/>
+                <a:graphic xmlns:a="http://schemas.openxmlformats.org/drawingml/2006/main">
+                  <a:graphicData uri="http://schemas.microsoft.com/office/word/2010/wordprocessingShape">
+                    <wps:wsp>
+                      <wps:cNvSpPr/>
+                      <wps:spPr>
+                        <a:xfrm>
+                          <a:off x="0" y="0"/>
+                          <a:ext cx="1687830" cy="689610"/>
+                        </a:xfrm>
+                        <a:prstGeom prst="rect">
+                          <a:avLst/>
+                        </a:prstGeom>
+                        <a:solidFill>
+                          <a:srgbClr val="FFFF00">
+                            <a:alpha val="32000"/>
+                          </a:srgbClr>
+                        </a:solidFill>
+                        <a:ln w="28575">
+                          <a:solidFill>
+                            <a:srgbClr val="EE0000"/>
+                          </a:solidFill>
+                        </a:ln>
+                      </wps:spPr>
+                      <wps:style>
+                        <a:lnRef idx="2">
+                          <a:schemeClr val="accent1">
+                            <a:shade val="15000"/>
+                          </a:schemeClr>
+                        </a:lnRef>
+                        <a:fillRef idx="1">
+                          <a:schemeClr val="accent1"/>
+                        </a:fillRef>
+                        <a:effectRef idx="0">
+                          <a:schemeClr val="accent1"/>
+                        </a:effectRef>
+                        <a:fontRef idx="minor">
+                          <a:schemeClr val="lt1"/>
+                        </a:fontRef>
+                      </wps:style>
+                      <wps:txbx>
+                        <w:txbxContent>
+                          <w:p>
+                            <w:pPr>
+                              <w:jc w:val="right"/>
+                              <w:rPr>
+                                <w:b/>
+                                <w:bCs/>
+                                <w:color w:val="000000" w:themeColor="text1"/>
+                                <w:sz w:val="32"/>
+                                <w:szCs w:val="32"/>
+                                <w:lang w:val="es-CL"/>
+                                <w14:shadow w14:blurRad="38100" w14:dist="19050" w14:dir="2700000" w14:sx="100000" w14:sy="100000" w14:kx="0" w14:ky="0" w14:algn="tl">
+                                  <w14:schemeClr w14:val="dk1">
+                                    <w14:alpha w14:val="60000"/>
+                                  </w14:schemeClr>
+                                </w14:shadow>
+                                <w14:textOutline w14:w="0" w14:cap="flat" w14:cmpd="sng" w14:algn="ctr">
+                                  <w14:noFill/>
+                                  <w14:prstDash w14:val="solid"/>
+                                  <w14:round/>
+                                </w14:textOutline>
+                              </w:rPr>
+                            </w:pPr>
+                            <w:r>
+                              <w:rPr>
+                                <w:b/>
+                                <w:bCs/>
+                                <w:color w:val="000000" w:themeColor="text1"/>
+                                <w:sz w:val="32"/>
+                                <w:szCs w:val="32"/>
+                                <w:lang w:val="es-CL"/>
+                                <w14:shadow w14:blurRad="38100" w14:dist="19050" w14:dir="2700000" w14:sx="100000" w14:sy="100000" w14:kx="0" w14:ky="0" w14:algn="tl">
+                                  <w14:schemeClr w14:val="dk1">
+                                    <w14:alpha w14:val="60000"/>
+                                  </w14:schemeClr>
+                                </w14:shadow>
+                                <w14:textOutline w14:w="0" w14:cap="flat" w14:cmpd="sng" w14:algn="ctr">
+                                  <w14:noFill/>
+                                  <w14:prstDash w14:val="solid"/>
+                                  <w14:round/>
+                                </w14:textOutline>
+                              </w:rPr>
+                              <w:t>7</w:t>
+                            </w:r>
+                          </w:p>
+                        </w:txbxContent>
+                      </wps:txbx>
+                      <wps:bodyPr rot="0" spcFirstLastPara="0" vertOverflow="overflow" horzOverflow="overflow" vert="horz" wrap="square" lIns="91440" tIns="45720" rIns="91440" bIns="45720" numCol="1" spcCol="0" rtlCol="0" fromWordArt="0" anchor="ctr" anchorCtr="0" forceAA="0" compatLnSpc="1">
+                        <a:prstTxWarp prst="textNoShape">
+                          <a:avLst/>
+                        </a:prstTxWarp>
+                        <a:noAutofit/>
+                      </wps:bodyPr>
+                    </wps:wsp>
+                  </a:graphicData>
+                </a:graphic>
+                <wp14:sizeRelH relativeFrom="margin">
+                  <wp14:pctWidth>0</wp14:pctWidth>
+                </wp14:sizeRelH>
+                <wp14:sizeRelV relativeFrom="margin">
+                  <wp14:pctHeight>0</wp14:pctHeight>
+                </wp14:sizeRelV>
+              </wp:anchor>
+            </w:drawing>
+          </mc:Choice>
+          <mc:Fallback>
+            <w:pict>
+              <v:rect w14:anchorId="020BEC85" id="_x0000_s1030" style="position:absolute;left:0;text-align:left;margin-left:100.05pt;margin-top:133.05pt;width:132.9pt;height:54.3pt;z-index:251679744;visibility:visible;mso-wrap-style:square;mso-width-percent:0;mso-height-percent:0;mso-wrap-distance-left:9pt;mso-wrap-distance-top:0;mso-wrap-distance-right:9pt;mso-wrap-distance-bottom:0;mso-position-horizontal:absolute;mso-position-horizontal-relative:margin;mso-position-vertical:absolute;mso-position-vertical-relative:text;mso-width-percent:0;mso-height-percent:0;mso-width-relative:margin;mso-height-relative:margin;v-text-anchor:middle" o:gfxdata="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" fillcolor="yellow" strokecolor="#e00" strokeweight="2.25pt">
+                <v:fill opacity="21074f"/>
+                <v:textbox>
+                  <w:txbxContent>
+                    <w:p>
+                      <w:pPr>
+                        <w:jc w:val="right"/>
+                        <w:rPr>
+                          <w:b/>
+                          <w:bCs/>
+                          <w:color w:val="000000" w:themeColor="text1"/>
+                          <w:sz w:val="32"/>
+                          <w:szCs w:val="32"/>
+                          <w:lang w:val="es-CL"/>
+                          <w14:shadow w14:blurRad="38100" w14:dist="19050" w14:dir="2700000" w14:sx="100000" w14:sy="100000" w14:kx="0" w14:ky="0" w14:algn="tl">
+                            <w14:schemeClr w14:val="dk1">
+                              <w14:alpha w14:val="60000"/>
+                            </w14:schemeClr>
+                          </w14:shadow>
+                          <w14:textOutline w14:w="0" w14:cap="flat" w14:cmpd="sng" w14:algn="ctr">
+                            <w14:noFill/>
+                            <w14:prstDash w14:val="solid"/>
+                            <w14:round/>
+                          </w14:textOutline>
+                        </w:rPr>
+                      </w:pPr>
+                      <w:r>
+                        <w:rPr>
+                          <w:b/>
+                          <w:bCs/>
+                          <w:color w:val="000000" w:themeColor="text1"/>
+                          <w:sz w:val="32"/>
+                          <w:szCs w:val="32"/>
+                          <w:lang w:val="es-CL"/>
+                          <w14:shadow w14:blurRad="38100" w14:dist="19050" w14:dir="2700000" w14:sx="100000" w14:sy="100000" w14:kx="0" w14:ky="0" w14:algn="tl">
+                            <w14:schemeClr w14:val="dk1">
+                              <w14:alpha w14:val="60000"/>
+                            </w14:schemeClr>
+                          </w14:shadow>
+                          <w14:textOutline w14:w="0" w14:cap="flat" w14:cmpd="sng" w14:algn="ctr">
+                            <w14:noFill/>
+                            <w14:prstDash w14:val="solid"/>
+                            <w14:round/>
+                          </w14:textOutline>
+                        </w:rPr>
+                        <w:t>7</w:t>
+                      </w:r>
+                    </w:p>
+                  </w:txbxContent>
+                </v:textbox>
+                <w10:wrap anchorx="margin"/>
+              </v:rect>
+            </w:pict>
+          </mc:Fallback>
+        </mc:AlternateContent>
+      </w:r>
+      <w:r>
+        <w:rPr>
+          <w:noProof/>
+          <w:highlight w:val="cyan"/>
+          <w:lang w:val="es-CL"/>
+        </w:rPr>
+        <mc:AlternateContent>
+          <mc:Choice Requires="wps">
+            <w:drawing>
+              <wp:anchor distT="0" distB="0" distL="114300" distR="114300" simplePos="0" relativeHeight="251681792" behindDoc="0" locked="0" layoutInCell="1" allowOverlap="1" wp14:anchorId="17FB7327" wp14:editId="7F159905">
+                <wp:simplePos x="0" y="0"/>
+                <wp:positionH relativeFrom="margin">
+                  <wp:posOffset>1224915</wp:posOffset>
+                </wp:positionH>
+                <wp:positionV relativeFrom="paragraph">
+                  <wp:posOffset>3122295</wp:posOffset>
+                </wp:positionV>
+                <wp:extent cx="2023110" cy="666750"/>
+                <wp:effectExtent l="19050" t="19050" r="15240" b="19050"/>
                 <wp:wrapNone/>
                 <wp:docPr id="497125985" name="Rectángulo 1"/>
                 <wp:cNvGraphicFramePr/>
@@ -7108,7 +7376,7 @@
                       <wps:spPr>
                         <a:xfrm>
                           <a:off x="0" y="0"/>
-                          <a:ext cx="991870" cy="402590"/>
+                          <a:ext cx="2023110" cy="666750"/>
                         </a:xfrm>
                         <a:prstGeom prst="rect">
                           <a:avLst/>
@@ -7208,7 +7476,7 @@
           </mc:Choice>
           <mc:Fallback>
             <w:pict>
-              <v:rect w14:anchorId="17FB7327" id="_x0000_s1030" style="position:absolute;left:0;text-align:left;margin-left:52.05pt;margin-top:146.85pt;width:78.1pt;height:31.7pt;z-index:251681792;visibility:visible;mso-wrap-style:square;mso-width-percent:0;mso-height-percent:0;mso-wrap-distance-left:9pt;mso-wrap-distance-top:0;mso-wrap-distance-right:9pt;mso-wrap-distance-bottom:0;mso-position-horizontal:absolute;mso-position-horizontal-relative:margin;mso-position-vertical:absolute;mso-position-vertical-relative:text;mso-width-percent:0;mso-height-percent:0;mso-width-relative:margin;mso-height-relative:margin;v-text-anchor:middle" o:gfxdata="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" fillcolor="yellow" strokecolor="#e00" strokeweight="2.25pt">
+              <v:rect w14:anchorId="17FB7327" id="_x0000_s1031" style="position:absolute;left:0;text-align:left;margin-left:96.45pt;margin-top:245.85pt;width:159.3pt;height:52.5pt;z-index:251681792;visibility:visible;mso-wrap-style:square;mso-width-percent:0;mso-height-percent:0;mso-wrap-distance-left:9pt;mso-wrap-distance-top:0;mso-wrap-distance-right:9pt;mso-wrap-distance-bottom:0;mso-position-horizontal:absolute;mso-position-horizontal-relative:margin;mso-position-vertical:absolute;mso-position-vertical-relative:text;mso-width-percent:0;mso-height-percent:0;mso-width-relative:margin;mso-height-relative:margin;v-text-anchor:middle" o:gfxdata="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" fillcolor="yellow" strokecolor="#e00" strokeweight="2.25pt">
                 <v:fill opacity="21074f"/>
                 <v:textbox>
                   <w:txbxContent>
@@ -7273,201 +7541,16 @@
         <mc:AlternateContent>
           <mc:Choice Requires="wps">
             <w:drawing>
-              <wp:anchor distT="0" distB="0" distL="114300" distR="114300" simplePos="0" relativeHeight="251679744" behindDoc="0" locked="0" layoutInCell="1" allowOverlap="1" wp14:anchorId="020BEC85" wp14:editId="1135D45B">
+              <wp:anchor distT="0" distB="0" distL="114300" distR="114300" simplePos="0" relativeHeight="251677696" behindDoc="0" locked="0" layoutInCell="1" allowOverlap="1" wp14:anchorId="0F94A642" wp14:editId="6A4FAA16">
                 <wp:simplePos x="0" y="0"/>
                 <wp:positionH relativeFrom="margin">
-                  <wp:posOffset>828675</wp:posOffset>
+                  <wp:posOffset>4402455</wp:posOffset>
                 </wp:positionH>
                 <wp:positionV relativeFrom="paragraph">
-                  <wp:posOffset>1189355</wp:posOffset>
+                  <wp:posOffset>1407795</wp:posOffset>
                 </wp:positionV>
-                <wp:extent cx="991870" cy="402590"/>
-                <wp:effectExtent l="19050" t="19050" r="17780" b="16510"/>
-                <wp:wrapNone/>
-                <wp:docPr id="540692441" name="Rectángulo 1"/>
-                <wp:cNvGraphicFramePr/>
-                <a:graphic xmlns:a="http://schemas.openxmlformats.org/drawingml/2006/main">
-                  <a:graphicData uri="http://schemas.microsoft.com/office/word/2010/wordprocessingShape">
-                    <wps:wsp>
-                      <wps:cNvSpPr/>
-                      <wps:spPr>
-                        <a:xfrm>
-                          <a:off x="0" y="0"/>
-                          <a:ext cx="991870" cy="402590"/>
-                        </a:xfrm>
-                        <a:prstGeom prst="rect">
-                          <a:avLst/>
-                        </a:prstGeom>
-                        <a:solidFill>
-                          <a:srgbClr val="FFFF00">
-                            <a:alpha val="32000"/>
-                          </a:srgbClr>
-                        </a:solidFill>
-                        <a:ln w="28575">
-                          <a:solidFill>
-                            <a:srgbClr val="EE0000"/>
-                          </a:solidFill>
-                        </a:ln>
-                      </wps:spPr>
-                      <wps:style>
-                        <a:lnRef idx="2">
-                          <a:schemeClr val="accent1">
-                            <a:shade val="15000"/>
-                          </a:schemeClr>
-                        </a:lnRef>
-                        <a:fillRef idx="1">
-                          <a:schemeClr val="accent1"/>
-                        </a:fillRef>
-                        <a:effectRef idx="0">
-                          <a:schemeClr val="accent1"/>
-                        </a:effectRef>
-                        <a:fontRef idx="minor">
-                          <a:schemeClr val="lt1"/>
-                        </a:fontRef>
-                      </wps:style>
-                      <wps:txbx>
-                        <w:txbxContent>
-                          <w:p>
-                            <w:pPr>
-                              <w:jc w:val="right"/>
-                              <w:rPr>
-                                <w:b/>
-                                <w:bCs/>
-                                <w:color w:val="000000" w:themeColor="text1"/>
-                                <w:sz w:val="32"/>
-                                <w:szCs w:val="32"/>
-                                <w:lang w:val="es-CL"/>
-                                <w14:shadow w14:blurRad="38100" w14:dist="19050" w14:dir="2700000" w14:sx="100000" w14:sy="100000" w14:kx="0" w14:ky="0" w14:algn="tl">
-                                  <w14:schemeClr w14:val="dk1">
-                                    <w14:alpha w14:val="60000"/>
-                                  </w14:schemeClr>
-                                </w14:shadow>
-                                <w14:textOutline w14:w="0" w14:cap="flat" w14:cmpd="sng" w14:algn="ctr">
-                                  <w14:noFill/>
-                                  <w14:prstDash w14:val="solid"/>
-                                  <w14:round/>
-                                </w14:textOutline>
-                              </w:rPr>
-                            </w:pPr>
-                            <w:r>
-                              <w:rPr>
-                                <w:b/>
-                                <w:bCs/>
-                                <w:color w:val="000000" w:themeColor="text1"/>
-                                <w:sz w:val="32"/>
-                                <w:szCs w:val="32"/>
-                                <w:lang w:val="es-CL"/>
-                                <w14:shadow w14:blurRad="38100" w14:dist="19050" w14:dir="2700000" w14:sx="100000" w14:sy="100000" w14:kx="0" w14:ky="0" w14:algn="tl">
-                                  <w14:schemeClr w14:val="dk1">
-                                    <w14:alpha w14:val="60000"/>
-                                  </w14:schemeClr>
-                                </w14:shadow>
-                                <w14:textOutline w14:w="0" w14:cap="flat" w14:cmpd="sng" w14:algn="ctr">
-                                  <w14:noFill/>
-                                  <w14:prstDash w14:val="solid"/>
-                                  <w14:round/>
-                                </w14:textOutline>
-                              </w:rPr>
-                              <w:t>7</w:t>
-                            </w:r>
-                          </w:p>
-                        </w:txbxContent>
-                      </wps:txbx>
-                      <wps:bodyPr rot="0" spcFirstLastPara="0" vertOverflow="overflow" horzOverflow="overflow" vert="horz" wrap="square" lIns="91440" tIns="45720" rIns="91440" bIns="45720" numCol="1" spcCol="0" rtlCol="0" fromWordArt="0" anchor="ctr" anchorCtr="0" forceAA="0" compatLnSpc="1">
-                        <a:prstTxWarp prst="textNoShape">
-                          <a:avLst/>
-                        </a:prstTxWarp>
-                        <a:noAutofit/>
-                      </wps:bodyPr>
-                    </wps:wsp>
-                  </a:graphicData>
-                </a:graphic>
-                <wp14:sizeRelH relativeFrom="margin">
-                  <wp14:pctWidth>0</wp14:pctWidth>
-                </wp14:sizeRelH>
-                <wp14:sizeRelV relativeFrom="margin">
-                  <wp14:pctHeight>0</wp14:pctHeight>
-                </wp14:sizeRelV>
-              </wp:anchor>
-            </w:drawing>
-          </mc:Choice>
-          <mc:Fallback>
-            <w:pict>
-              <v:rect w14:anchorId="020BEC85" id="_x0000_s1031" style="position:absolute;left:0;text-align:left;margin-left:65.25pt;margin-top:93.65pt;width:78.1pt;height:31.7pt;z-index:251679744;visibility:visible;mso-wrap-style:square;mso-width-percent:0;mso-height-percent:0;mso-wrap-distance-left:9pt;mso-wrap-distance-top:0;mso-wrap-distance-right:9pt;mso-wrap-distance-bottom:0;mso-position-horizontal:absolute;mso-position-horizontal-relative:margin;mso-position-vertical:absolute;mso-position-vertical-relative:text;mso-width-percent:0;mso-height-percent:0;mso-width-relative:margin;mso-height-relative:margin;v-text-anchor:middle" o:gfxdata="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" fillcolor="yellow" strokecolor="#e00" strokeweight="2.25pt">
-                <v:fill opacity="21074f"/>
-                <v:textbox>
-                  <w:txbxContent>
-                    <w:p>
-                      <w:pPr>
-                        <w:jc w:val="right"/>
-                        <w:rPr>
-                          <w:b/>
-                          <w:bCs/>
-                          <w:color w:val="000000" w:themeColor="text1"/>
-                          <w:sz w:val="32"/>
-                          <w:szCs w:val="32"/>
-                          <w:lang w:val="es-CL"/>
-                          <w14:shadow w14:blurRad="38100" w14:dist="19050" w14:dir="2700000" w14:sx="100000" w14:sy="100000" w14:kx="0" w14:ky="0" w14:algn="tl">
-                            <w14:schemeClr w14:val="dk1">
-                              <w14:alpha w14:val="60000"/>
-                            </w14:schemeClr>
-                          </w14:shadow>
-                          <w14:textOutline w14:w="0" w14:cap="flat" w14:cmpd="sng" w14:algn="ctr">
-                            <w14:noFill/>
-                            <w14:prstDash w14:val="solid"/>
-                            <w14:round/>
-                          </w14:textOutline>
-                        </w:rPr>
-                      </w:pPr>
-                      <w:r>
-                        <w:rPr>
-                          <w:b/>
-                          <w:bCs/>
-                          <w:color w:val="000000" w:themeColor="text1"/>
-                          <w:sz w:val="32"/>
-                          <w:szCs w:val="32"/>
-                          <w:lang w:val="es-CL"/>
-                          <w14:shadow w14:blurRad="38100" w14:dist="19050" w14:dir="2700000" w14:sx="100000" w14:sy="100000" w14:kx="0" w14:ky="0" w14:algn="tl">
-                            <w14:schemeClr w14:val="dk1">
-                              <w14:alpha w14:val="60000"/>
-                            </w14:schemeClr>
-                          </w14:shadow>
-                          <w14:textOutline w14:w="0" w14:cap="flat" w14:cmpd="sng" w14:algn="ctr">
-                            <w14:noFill/>
-                            <w14:prstDash w14:val="solid"/>
-                            <w14:round/>
-                          </w14:textOutline>
-                        </w:rPr>
-                        <w:t>7</w:t>
-                      </w:r>
-                    </w:p>
-                  </w:txbxContent>
-                </v:textbox>
-                <w10:wrap anchorx="margin"/>
-              </v:rect>
-            </w:pict>
-          </mc:Fallback>
-        </mc:AlternateContent>
-      </w:r>
-      <w:r>
-        <w:rPr>
-          <w:noProof/>
-          <w:highlight w:val="cyan"/>
-          <w:lang w:val="es-CL"/>
-        </w:rPr>
-        <mc:AlternateContent>
-          <mc:Choice Requires="wps">
-            <w:drawing>
-              <wp:anchor distT="0" distB="0" distL="114300" distR="114300" simplePos="0" relativeHeight="251677696" behindDoc="0" locked="0" layoutInCell="1" allowOverlap="1" wp14:anchorId="0F94A642" wp14:editId="73A7955C">
-                <wp:simplePos x="0" y="0"/>
-                <wp:positionH relativeFrom="margin">
-                  <wp:posOffset>2693035</wp:posOffset>
-                </wp:positionH>
-                <wp:positionV relativeFrom="paragraph">
-                  <wp:posOffset>955675</wp:posOffset>
-                </wp:positionV>
-                <wp:extent cx="509270" cy="342900"/>
-                <wp:effectExtent l="19050" t="19050" r="24130" b="19050"/>
+                <wp:extent cx="697230" cy="342900"/>
+                <wp:effectExtent l="19050" t="19050" r="26670" b="19050"/>
                 <wp:wrapNone/>
                 <wp:docPr id="23394338" name="Rectángulo 1"/>
                 <wp:cNvGraphicFramePr/>
@@ -7478,7 +7561,7 @@
                       <wps:spPr>
                         <a:xfrm>
                           <a:off x="0" y="0"/>
-                          <a:ext cx="509270" cy="342900"/>
+                          <a:ext cx="697230" cy="342900"/>
                         </a:xfrm>
                         <a:prstGeom prst="rect">
                           <a:avLst/>
@@ -7578,7 +7661,7 @@
           </mc:Choice>
           <mc:Fallback>
             <w:pict>
-              <v:rect w14:anchorId="0F94A642" id="_x0000_s1032" style="position:absolute;left:0;text-align:left;margin-left:212.05pt;margin-top:75.25pt;width:40.1pt;height:27pt;z-index:251677696;visibility:visible;mso-wrap-style:square;mso-width-percent:0;mso-height-percent:0;mso-wrap-distance-left:9pt;mso-wrap-distance-top:0;mso-wrap-distance-right:9pt;mso-wrap-distance-bottom:0;mso-position-horizontal:absolute;mso-position-horizontal-relative:margin;mso-position-vertical:absolute;mso-position-vertical-relative:text;mso-width-percent:0;mso-height-percent:0;mso-width-relative:margin;mso-height-relative:margin;v-text-anchor:middle" o:gfxdata="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" fillcolor="yellow" strokecolor="#e00" strokeweight="2.25pt">
+              <v:rect w14:anchorId="0F94A642" id="_x0000_s1032" style="position:absolute;left:0;text-align:left;margin-left:346.65pt;margin-top:110.85pt;width:54.9pt;height:27pt;z-index:251677696;visibility:visible;mso-wrap-style:square;mso-width-percent:0;mso-height-percent:0;mso-wrap-distance-left:9pt;mso-wrap-distance-top:0;mso-wrap-distance-right:9pt;mso-wrap-distance-bottom:0;mso-position-horizontal:absolute;mso-position-horizontal-relative:margin;mso-position-vertical:absolute;mso-position-vertical-relative:text;mso-width-percent:0;mso-height-percent:0;mso-width-relative:margin;mso-height-relative:margin;v-text-anchor:middle" o:gfxdata="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" fillcolor="yellow" strokecolor="#e00" strokeweight="2.25pt">
                 <v:fill opacity="21074f"/>
                 <v:textbox>
                   <w:txbxContent>
@@ -7643,16 +7726,16 @@
         <mc:AlternateContent>
           <mc:Choice Requires="wps">
             <w:drawing>
-              <wp:anchor distT="0" distB="0" distL="114300" distR="114300" simplePos="0" relativeHeight="251675648" behindDoc="0" locked="0" layoutInCell="1" allowOverlap="1" wp14:anchorId="129F7EF8" wp14:editId="23086C18">
+              <wp:anchor distT="0" distB="0" distL="114300" distR="114300" simplePos="0" relativeHeight="251675648" behindDoc="0" locked="0" layoutInCell="1" allowOverlap="1" wp14:anchorId="129F7EF8" wp14:editId="4C9146CB">
                 <wp:simplePos x="0" y="0"/>
                 <wp:positionH relativeFrom="margin">
-                  <wp:posOffset>2042795</wp:posOffset>
+                  <wp:posOffset>3381375</wp:posOffset>
                 </wp:positionH>
                 <wp:positionV relativeFrom="paragraph">
-                  <wp:posOffset>986155</wp:posOffset>
+                  <wp:posOffset>1407795</wp:posOffset>
                 </wp:positionV>
-                <wp:extent cx="509270" cy="342900"/>
-                <wp:effectExtent l="19050" t="19050" r="24130" b="19050"/>
+                <wp:extent cx="636270" cy="342900"/>
+                <wp:effectExtent l="19050" t="19050" r="11430" b="19050"/>
                 <wp:wrapNone/>
                 <wp:docPr id="889698805" name="Rectángulo 1"/>
                 <wp:cNvGraphicFramePr/>
@@ -7663,7 +7746,7 @@
                       <wps:spPr>
                         <a:xfrm>
                           <a:off x="0" y="0"/>
-                          <a:ext cx="509270" cy="342900"/>
+                          <a:ext cx="636270" cy="342900"/>
                         </a:xfrm>
                         <a:prstGeom prst="rect">
                           <a:avLst/>
@@ -7763,7 +7846,7 @@
           </mc:Choice>
           <mc:Fallback>
             <w:pict>
-              <v:rect w14:anchorId="129F7EF8" id="_x0000_s1033" style="position:absolute;left:0;text-align:left;margin-left:160.85pt;margin-top:77.65pt;width:40.1pt;height:27pt;z-index:251675648;visibility:visible;mso-wrap-style:square;mso-width-percent:0;mso-height-percent:0;mso-wrap-distance-left:9pt;mso-wrap-distance-top:0;mso-wrap-distance-right:9pt;mso-wrap-distance-bottom:0;mso-position-horizontal:absolute;mso-position-horizontal-relative:margin;mso-position-vertical:absolute;mso-position-vertical-relative:text;mso-width-percent:0;mso-height-percent:0;mso-width-relative:margin;mso-height-relative:margin;v-text-anchor:middle" o:gfxdata="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" fillcolor="yellow" strokecolor="#e00" strokeweight="2.25pt">
+              <v:rect w14:anchorId="129F7EF8" id="_x0000_s1033" style="position:absolute;left:0;text-align:left;margin-left:266.25pt;margin-top:110.85pt;width:50.1pt;height:27pt;z-index:251675648;visibility:visible;mso-wrap-style:square;mso-width-percent:0;mso-height-percent:0;mso-wrap-distance-left:9pt;mso-wrap-distance-top:0;mso-wrap-distance-right:9pt;mso-wrap-distance-bottom:0;mso-position-horizontal:absolute;mso-position-horizontal-relative:margin;mso-position-vertical:absolute;mso-position-vertical-relative:text;mso-width-percent:0;mso-height-percent:0;mso-width-relative:margin;mso-height-relative:margin;v-text-anchor:middle" o:gfxdata="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" fillcolor="yellow" strokecolor="#e00" strokeweight="2.25pt">
                 <v:fill opacity="21074f"/>
                 <v:textbox>
                   <w:txbxContent>
@@ -7828,16 +7911,201 @@
         <mc:AlternateContent>
           <mc:Choice Requires="wps">
             <w:drawing>
-              <wp:anchor distT="0" distB="0" distL="114300" distR="114300" simplePos="0" relativeHeight="251673600" behindDoc="0" locked="0" layoutInCell="1" allowOverlap="1" wp14:anchorId="3A6C2955" wp14:editId="54E78646">
+              <wp:anchor distT="0" distB="0" distL="114300" distR="114300" simplePos="0" relativeHeight="251671552" behindDoc="0" locked="0" layoutInCell="1" allowOverlap="1" wp14:anchorId="4D079FEA" wp14:editId="52F9C9D5">
                 <wp:simplePos x="0" y="0"/>
                 <wp:positionH relativeFrom="margin">
-                  <wp:posOffset>1712595</wp:posOffset>
+                  <wp:posOffset>897255</wp:posOffset>
                 </wp:positionH>
                 <wp:positionV relativeFrom="paragraph">
-                  <wp:posOffset>681355</wp:posOffset>
+                  <wp:posOffset>729615</wp:posOffset>
                 </wp:positionV>
-                <wp:extent cx="509270" cy="342900"/>
-                <wp:effectExtent l="19050" t="19050" r="24130" b="19050"/>
+                <wp:extent cx="621030" cy="342900"/>
+                <wp:effectExtent l="19050" t="19050" r="26670" b="19050"/>
+                <wp:wrapNone/>
+                <wp:docPr id="2067919406" name="Rectángulo 1"/>
+                <wp:cNvGraphicFramePr/>
+                <a:graphic xmlns:a="http://schemas.openxmlformats.org/drawingml/2006/main">
+                  <a:graphicData uri="http://schemas.microsoft.com/office/word/2010/wordprocessingShape">
+                    <wps:wsp>
+                      <wps:cNvSpPr/>
+                      <wps:spPr>
+                        <a:xfrm>
+                          <a:off x="0" y="0"/>
+                          <a:ext cx="621030" cy="342900"/>
+                        </a:xfrm>
+                        <a:prstGeom prst="rect">
+                          <a:avLst/>
+                        </a:prstGeom>
+                        <a:solidFill>
+                          <a:srgbClr val="FFFF00">
+                            <a:alpha val="32000"/>
+                          </a:srgbClr>
+                        </a:solidFill>
+                        <a:ln w="28575">
+                          <a:solidFill>
+                            <a:srgbClr val="EE0000"/>
+                          </a:solidFill>
+                        </a:ln>
+                      </wps:spPr>
+                      <wps:style>
+                        <a:lnRef idx="2">
+                          <a:schemeClr val="accent1">
+                            <a:shade val="15000"/>
+                          </a:schemeClr>
+                        </a:lnRef>
+                        <a:fillRef idx="1">
+                          <a:schemeClr val="accent1"/>
+                        </a:fillRef>
+                        <a:effectRef idx="0">
+                          <a:schemeClr val="accent1"/>
+                        </a:effectRef>
+                        <a:fontRef idx="minor">
+                          <a:schemeClr val="lt1"/>
+                        </a:fontRef>
+                      </wps:style>
+                      <wps:txbx>
+                        <w:txbxContent>
+                          <w:p>
+                            <w:pPr>
+                              <w:jc w:val="right"/>
+                              <w:rPr>
+                                <w:b/>
+                                <w:bCs/>
+                                <w:color w:val="000000" w:themeColor="text1"/>
+                                <w:sz w:val="32"/>
+                                <w:szCs w:val="32"/>
+                                <w:lang w:val="es-CL"/>
+                                <w14:shadow w14:blurRad="38100" w14:dist="19050" w14:dir="2700000" w14:sx="100000" w14:sy="100000" w14:kx="0" w14:ky="0" w14:algn="tl">
+                                  <w14:schemeClr w14:val="dk1">
+                                    <w14:alpha w14:val="60000"/>
+                                  </w14:schemeClr>
+                                </w14:shadow>
+                                <w14:textOutline w14:w="0" w14:cap="flat" w14:cmpd="sng" w14:algn="ctr">
+                                  <w14:noFill/>
+                                  <w14:prstDash w14:val="solid"/>
+                                  <w14:round/>
+                                </w14:textOutline>
+                              </w:rPr>
+                            </w:pPr>
+                            <w:r>
+                              <w:rPr>
+                                <w:b/>
+                                <w:bCs/>
+                                <w:color w:val="000000" w:themeColor="text1"/>
+                                <w:sz w:val="32"/>
+                                <w:szCs w:val="32"/>
+                                <w:lang w:val="es-CL"/>
+                                <w14:shadow w14:blurRad="38100" w14:dist="19050" w14:dir="2700000" w14:sx="100000" w14:sy="100000" w14:kx="0" w14:ky="0" w14:algn="tl">
+                                  <w14:schemeClr w14:val="dk1">
+                                    <w14:alpha w14:val="60000"/>
+                                  </w14:schemeClr>
+                                </w14:shadow>
+                                <w14:textOutline w14:w="0" w14:cap="flat" w14:cmpd="sng" w14:algn="ctr">
+                                  <w14:noFill/>
+                                  <w14:prstDash w14:val="solid"/>
+                                  <w14:round/>
+                                </w14:textOutline>
+                              </w:rPr>
+                              <w:t>3</w:t>
+                            </w:r>
+                          </w:p>
+                        </w:txbxContent>
+                      </wps:txbx>
+                      <wps:bodyPr rot="0" spcFirstLastPara="0" vertOverflow="overflow" horzOverflow="overflow" vert="horz" wrap="square" lIns="91440" tIns="45720" rIns="91440" bIns="45720" numCol="1" spcCol="0" rtlCol="0" fromWordArt="0" anchor="ctr" anchorCtr="0" forceAA="0" compatLnSpc="1">
+                        <a:prstTxWarp prst="textNoShape">
+                          <a:avLst/>
+                        </a:prstTxWarp>
+                        <a:noAutofit/>
+                      </wps:bodyPr>
+                    </wps:wsp>
+                  </a:graphicData>
+                </a:graphic>
+                <wp14:sizeRelH relativeFrom="margin">
+                  <wp14:pctWidth>0</wp14:pctWidth>
+                </wp14:sizeRelH>
+                <wp14:sizeRelV relativeFrom="margin">
+                  <wp14:pctHeight>0</wp14:pctHeight>
+                </wp14:sizeRelV>
+              </wp:anchor>
+            </w:drawing>
+          </mc:Choice>
+          <mc:Fallback>
+            <w:pict>
+              <v:rect w14:anchorId="4D079FEA" id="_x0000_s1034" style="position:absolute;left:0;text-align:left;margin-left:70.65pt;margin-top:57.45pt;width:48.9pt;height:27pt;z-index:251671552;visibility:visible;mso-wrap-style:square;mso-width-percent:0;mso-height-percent:0;mso-wrap-distance-left:9pt;mso-wrap-distance-top:0;mso-wrap-distance-right:9pt;mso-wrap-distance-bottom:0;mso-position-horizontal:absolute;mso-position-horizontal-relative:margin;mso-position-vertical:absolute;mso-position-vertical-relative:text;mso-width-percent:0;mso-height-percent:0;mso-width-relative:margin;mso-height-relative:margin;v-text-anchor:middle" o:gfxdata="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" fillcolor="yellow" strokecolor="#e00" strokeweight="2.25pt">
+                <v:fill opacity="21074f"/>
+                <v:textbox>
+                  <w:txbxContent>
+                    <w:p>
+                      <w:pPr>
+                        <w:jc w:val="right"/>
+                        <w:rPr>
+                          <w:b/>
+                          <w:bCs/>
+                          <w:color w:val="000000" w:themeColor="text1"/>
+                          <w:sz w:val="32"/>
+                          <w:szCs w:val="32"/>
+                          <w:lang w:val="es-CL"/>
+                          <w14:shadow w14:blurRad="38100" w14:dist="19050" w14:dir="2700000" w14:sx="100000" w14:sy="100000" w14:kx="0" w14:ky="0" w14:algn="tl">
+                            <w14:schemeClr w14:val="dk1">
+                              <w14:alpha w14:val="60000"/>
+                            </w14:schemeClr>
+                          </w14:shadow>
+                          <w14:textOutline w14:w="0" w14:cap="flat" w14:cmpd="sng" w14:algn="ctr">
+                            <w14:noFill/>
+                            <w14:prstDash w14:val="solid"/>
+                            <w14:round/>
+                          </w14:textOutline>
+                        </w:rPr>
+                      </w:pPr>
+                      <w:r>
+                        <w:rPr>
+                          <w:b/>
+                          <w:bCs/>
+                          <w:color w:val="000000" w:themeColor="text1"/>
+                          <w:sz w:val="32"/>
+                          <w:szCs w:val="32"/>
+                          <w:lang w:val="es-CL"/>
+                          <w14:shadow w14:blurRad="38100" w14:dist="19050" w14:dir="2700000" w14:sx="100000" w14:sy="100000" w14:kx="0" w14:ky="0" w14:algn="tl">
+                            <w14:schemeClr w14:val="dk1">
+                              <w14:alpha w14:val="60000"/>
+                            </w14:schemeClr>
+                          </w14:shadow>
+                          <w14:textOutline w14:w="0" w14:cap="flat" w14:cmpd="sng" w14:algn="ctr">
+                            <w14:noFill/>
+                            <w14:prstDash w14:val="solid"/>
+                            <w14:round/>
+                          </w14:textOutline>
+                        </w:rPr>
+                        <w:t>3</w:t>
+                      </w:r>
+                    </w:p>
+                  </w:txbxContent>
+                </v:textbox>
+                <w10:wrap anchorx="margin"/>
+              </v:rect>
+            </w:pict>
+          </mc:Fallback>
+        </mc:AlternateContent>
+      </w:r>
+      <w:r>
+        <w:rPr>
+          <w:noProof/>
+          <w:highlight w:val="cyan"/>
+          <w:lang w:val="es-CL"/>
+        </w:rPr>
+        <mc:AlternateContent>
+          <mc:Choice Requires="wps">
+            <w:drawing>
+              <wp:anchor distT="0" distB="0" distL="114300" distR="114300" simplePos="0" relativeHeight="251673600" behindDoc="0" locked="0" layoutInCell="1" allowOverlap="1" wp14:anchorId="3A6C2955" wp14:editId="1E77BF46">
+                <wp:simplePos x="0" y="0"/>
+                <wp:positionH relativeFrom="margin">
+                  <wp:posOffset>2870835</wp:posOffset>
+                </wp:positionH>
+                <wp:positionV relativeFrom="paragraph">
+                  <wp:posOffset>1102995</wp:posOffset>
+                </wp:positionV>
+                <wp:extent cx="647700" cy="342900"/>
+                <wp:effectExtent l="19050" t="19050" r="19050" b="19050"/>
                 <wp:wrapNone/>
                 <wp:docPr id="256636323" name="Rectángulo 1"/>
                 <wp:cNvGraphicFramePr/>
@@ -7848,7 +8116,7 @@
                       <wps:spPr>
                         <a:xfrm>
                           <a:off x="0" y="0"/>
-                          <a:ext cx="509270" cy="342900"/>
+                          <a:ext cx="647700" cy="342900"/>
                         </a:xfrm>
                         <a:prstGeom prst="rect">
                           <a:avLst/>
@@ -7948,7 +8216,7 @@
           </mc:Choice>
           <mc:Fallback>
             <w:pict>
-              <v:rect w14:anchorId="3A6C2955" id="_x0000_s1034" style="position:absolute;left:0;text-align:left;margin-left:134.85pt;margin-top:53.65pt;width:40.1pt;height:27pt;z-index:251673600;visibility:visible;mso-wrap-style:square;mso-width-percent:0;mso-height-percent:0;mso-wrap-distance-left:9pt;mso-wrap-distance-top:0;mso-wrap-distance-right:9pt;mso-wrap-distance-bottom:0;mso-position-horizontal:absolute;mso-position-horizontal-relative:margin;mso-position-vertical:absolute;mso-position-vertical-relative:text;mso-width-percent:0;mso-height-percent:0;mso-width-relative:margin;mso-height-relative:margin;v-text-anchor:middle" o:gfxdata="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" fillcolor="yellow" strokecolor="#e00" strokeweight="2.25pt">
+              <v:rect w14:anchorId="3A6C2955" id="_x0000_s1035" style="position:absolute;left:0;text-align:left;margin-left:226.05pt;margin-top:86.85pt;width:51pt;height:27pt;z-index:251673600;visibility:visible;mso-wrap-style:square;mso-width-percent:0;mso-height-percent:0;mso-wrap-distance-left:9pt;mso-wrap-distance-top:0;mso-wrap-distance-right:9pt;mso-wrap-distance-bottom:0;mso-position-horizontal:absolute;mso-position-horizontal-relative:margin;mso-position-vertical:absolute;mso-position-vertical-relative:text;mso-width-percent:0;mso-height-percent:0;mso-width-relative:margin;mso-height-relative:margin;v-text-anchor:middle" o:gfxdata="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" fillcolor="yellow" strokecolor="#e00" strokeweight="2.25pt">
                 <v:fill opacity="21074f"/>
                 <v:textbox>
                   <w:txbxContent>
@@ -8013,201 +8281,16 @@
         <mc:AlternateContent>
           <mc:Choice Requires="wps">
             <w:drawing>
-              <wp:anchor distT="0" distB="0" distL="114300" distR="114300" simplePos="0" relativeHeight="251671552" behindDoc="0" locked="0" layoutInCell="1" allowOverlap="1" wp14:anchorId="4D079FEA" wp14:editId="4ABA0E46">
+              <wp:anchor distT="0" distB="0" distL="114300" distR="114300" simplePos="0" relativeHeight="251669504" behindDoc="0" locked="0" layoutInCell="1" allowOverlap="1" wp14:anchorId="567504E8" wp14:editId="3D7C3F05">
                 <wp:simplePos x="0" y="0"/>
                 <wp:positionH relativeFrom="margin">
-                  <wp:posOffset>625475</wp:posOffset>
+                  <wp:posOffset>1133475</wp:posOffset>
                 </wp:positionH>
                 <wp:positionV relativeFrom="paragraph">
-                  <wp:posOffset>564515</wp:posOffset>
+                  <wp:posOffset>310515</wp:posOffset>
                 </wp:positionV>
-                <wp:extent cx="509270" cy="342900"/>
-                <wp:effectExtent l="19050" t="19050" r="24130" b="19050"/>
-                <wp:wrapNone/>
-                <wp:docPr id="2067919406" name="Rectángulo 1"/>
-                <wp:cNvGraphicFramePr/>
-                <a:graphic xmlns:a="http://schemas.openxmlformats.org/drawingml/2006/main">
-                  <a:graphicData uri="http://schemas.microsoft.com/office/word/2010/wordprocessingShape">
-                    <wps:wsp>
-                      <wps:cNvSpPr/>
-                      <wps:spPr>
-                        <a:xfrm>
-                          <a:off x="0" y="0"/>
-                          <a:ext cx="509270" cy="342900"/>
-                        </a:xfrm>
-                        <a:prstGeom prst="rect">
-                          <a:avLst/>
-                        </a:prstGeom>
-                        <a:solidFill>
-                          <a:srgbClr val="FFFF00">
-                            <a:alpha val="32000"/>
-                          </a:srgbClr>
-                        </a:solidFill>
-                        <a:ln w="28575">
-                          <a:solidFill>
-                            <a:srgbClr val="EE0000"/>
-                          </a:solidFill>
-                        </a:ln>
-                      </wps:spPr>
-                      <wps:style>
-                        <a:lnRef idx="2">
-                          <a:schemeClr val="accent1">
-                            <a:shade val="15000"/>
-                          </a:schemeClr>
-                        </a:lnRef>
-                        <a:fillRef idx="1">
-                          <a:schemeClr val="accent1"/>
-                        </a:fillRef>
-                        <a:effectRef idx="0">
-                          <a:schemeClr val="accent1"/>
-                        </a:effectRef>
-                        <a:fontRef idx="minor">
-                          <a:schemeClr val="lt1"/>
-                        </a:fontRef>
-                      </wps:style>
-                      <wps:txbx>
-                        <w:txbxContent>
-                          <w:p>
-                            <w:pPr>
-                              <w:jc w:val="right"/>
-                              <w:rPr>
-                                <w:b/>
-                                <w:bCs/>
-                                <w:color w:val="000000" w:themeColor="text1"/>
-                                <w:sz w:val="32"/>
-                                <w:szCs w:val="32"/>
-                                <w:lang w:val="es-CL"/>
-                                <w14:shadow w14:blurRad="38100" w14:dist="19050" w14:dir="2700000" w14:sx="100000" w14:sy="100000" w14:kx="0" w14:ky="0" w14:algn="tl">
-                                  <w14:schemeClr w14:val="dk1">
-                                    <w14:alpha w14:val="60000"/>
-                                  </w14:schemeClr>
-                                </w14:shadow>
-                                <w14:textOutline w14:w="0" w14:cap="flat" w14:cmpd="sng" w14:algn="ctr">
-                                  <w14:noFill/>
-                                  <w14:prstDash w14:val="solid"/>
-                                  <w14:round/>
-                                </w14:textOutline>
-                              </w:rPr>
-                            </w:pPr>
-                            <w:r>
-                              <w:rPr>
-                                <w:b/>
-                                <w:bCs/>
-                                <w:color w:val="000000" w:themeColor="text1"/>
-                                <w:sz w:val="32"/>
-                                <w:szCs w:val="32"/>
-                                <w:lang w:val="es-CL"/>
-                                <w14:shadow w14:blurRad="38100" w14:dist="19050" w14:dir="2700000" w14:sx="100000" w14:sy="100000" w14:kx="0" w14:ky="0" w14:algn="tl">
-                                  <w14:schemeClr w14:val="dk1">
-                                    <w14:alpha w14:val="60000"/>
-                                  </w14:schemeClr>
-                                </w14:shadow>
-                                <w14:textOutline w14:w="0" w14:cap="flat" w14:cmpd="sng" w14:algn="ctr">
-                                  <w14:noFill/>
-                                  <w14:prstDash w14:val="solid"/>
-                                  <w14:round/>
-                                </w14:textOutline>
-                              </w:rPr>
-                              <w:t>3</w:t>
-                            </w:r>
-                          </w:p>
-                        </w:txbxContent>
-                      </wps:txbx>
-                      <wps:bodyPr rot="0" spcFirstLastPara="0" vertOverflow="overflow" horzOverflow="overflow" vert="horz" wrap="square" lIns="91440" tIns="45720" rIns="91440" bIns="45720" numCol="1" spcCol="0" rtlCol="0" fromWordArt="0" anchor="ctr" anchorCtr="0" forceAA="0" compatLnSpc="1">
-                        <a:prstTxWarp prst="textNoShape">
-                          <a:avLst/>
-                        </a:prstTxWarp>
-                        <a:noAutofit/>
-                      </wps:bodyPr>
-                    </wps:wsp>
-                  </a:graphicData>
-                </a:graphic>
-                <wp14:sizeRelH relativeFrom="margin">
-                  <wp14:pctWidth>0</wp14:pctWidth>
-                </wp14:sizeRelH>
-                <wp14:sizeRelV relativeFrom="margin">
-                  <wp14:pctHeight>0</wp14:pctHeight>
-                </wp14:sizeRelV>
-              </wp:anchor>
-            </w:drawing>
-          </mc:Choice>
-          <mc:Fallback>
-            <w:pict>
-              <v:rect w14:anchorId="4D079FEA" id="_x0000_s1035" style="position:absolute;left:0;text-align:left;margin-left:49.25pt;margin-top:44.45pt;width:40.1pt;height:27pt;z-index:251671552;visibility:visible;mso-wrap-style:square;mso-width-percent:0;mso-height-percent:0;mso-wrap-distance-left:9pt;mso-wrap-distance-top:0;mso-wrap-distance-right:9pt;mso-wrap-distance-bottom:0;mso-position-horizontal:absolute;mso-position-horizontal-relative:margin;mso-position-vertical:absolute;mso-position-vertical-relative:text;mso-width-percent:0;mso-height-percent:0;mso-width-relative:margin;mso-height-relative:margin;v-text-anchor:middle" o:gfxdata="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" fillcolor="yellow" strokecolor="#e00" strokeweight="2.25pt">
-                <v:fill opacity="21074f"/>
-                <v:textbox>
-                  <w:txbxContent>
-                    <w:p>
-                      <w:pPr>
-                        <w:jc w:val="right"/>
-                        <w:rPr>
-                          <w:b/>
-                          <w:bCs/>
-                          <w:color w:val="000000" w:themeColor="text1"/>
-                          <w:sz w:val="32"/>
-                          <w:szCs w:val="32"/>
-                          <w:lang w:val="es-CL"/>
-                          <w14:shadow w14:blurRad="38100" w14:dist="19050" w14:dir="2700000" w14:sx="100000" w14:sy="100000" w14:kx="0" w14:ky="0" w14:algn="tl">
-                            <w14:schemeClr w14:val="dk1">
-                              <w14:alpha w14:val="60000"/>
-                            </w14:schemeClr>
-                          </w14:shadow>
-                          <w14:textOutline w14:w="0" w14:cap="flat" w14:cmpd="sng" w14:algn="ctr">
-                            <w14:noFill/>
-                            <w14:prstDash w14:val="solid"/>
-                            <w14:round/>
-                          </w14:textOutline>
-                        </w:rPr>
-                      </w:pPr>
-                      <w:r>
-                        <w:rPr>
-                          <w:b/>
-                          <w:bCs/>
-                          <w:color w:val="000000" w:themeColor="text1"/>
-                          <w:sz w:val="32"/>
-                          <w:szCs w:val="32"/>
-                          <w:lang w:val="es-CL"/>
-                          <w14:shadow w14:blurRad="38100" w14:dist="19050" w14:dir="2700000" w14:sx="100000" w14:sy="100000" w14:kx="0" w14:ky="0" w14:algn="tl">
-                            <w14:schemeClr w14:val="dk1">
-                              <w14:alpha w14:val="60000"/>
-                            </w14:schemeClr>
-                          </w14:shadow>
-                          <w14:textOutline w14:w="0" w14:cap="flat" w14:cmpd="sng" w14:algn="ctr">
-                            <w14:noFill/>
-                            <w14:prstDash w14:val="solid"/>
-                            <w14:round/>
-                          </w14:textOutline>
-                        </w:rPr>
-                        <w:t>3</w:t>
-                      </w:r>
-                    </w:p>
-                  </w:txbxContent>
-                </v:textbox>
-                <w10:wrap anchorx="margin"/>
-              </v:rect>
-            </w:pict>
-          </mc:Fallback>
-        </mc:AlternateContent>
-      </w:r>
-      <w:r>
-        <w:rPr>
-          <w:noProof/>
-          <w:highlight w:val="cyan"/>
-          <w:lang w:val="es-CL"/>
-        </w:rPr>
-        <mc:AlternateContent>
-          <mc:Choice Requires="wps">
-            <w:drawing>
-              <wp:anchor distT="0" distB="0" distL="114300" distR="114300" simplePos="0" relativeHeight="251669504" behindDoc="0" locked="0" layoutInCell="1" allowOverlap="1" wp14:anchorId="567504E8" wp14:editId="38AD490C">
-                <wp:simplePos x="0" y="0"/>
-                <wp:positionH relativeFrom="margin">
-                  <wp:posOffset>782955</wp:posOffset>
-                </wp:positionH>
-                <wp:positionV relativeFrom="paragraph">
-                  <wp:posOffset>255905</wp:posOffset>
-                </wp:positionV>
-                <wp:extent cx="1017270" cy="342900"/>
-                <wp:effectExtent l="19050" t="19050" r="11430" b="19050"/>
+                <wp:extent cx="1733550" cy="342900"/>
+                <wp:effectExtent l="19050" t="19050" r="19050" b="19050"/>
                 <wp:wrapNone/>
                 <wp:docPr id="1037208117" name="Rectángulo 1"/>
                 <wp:cNvGraphicFramePr/>
@@ -8218,7 +8301,7 @@
                       <wps:spPr>
                         <a:xfrm>
                           <a:off x="0" y="0"/>
-                          <a:ext cx="1017270" cy="342900"/>
+                          <a:ext cx="1733550" cy="342900"/>
                         </a:xfrm>
                         <a:prstGeom prst="rect">
                           <a:avLst/>
@@ -8318,7 +8401,7 @@
           </mc:Choice>
           <mc:Fallback>
             <w:pict>
-              <v:rect w14:anchorId="567504E8" id="_x0000_s1036" style="position:absolute;left:0;text-align:left;margin-left:61.65pt;margin-top:20.15pt;width:80.1pt;height:27pt;z-index:251669504;visibility:visible;mso-wrap-style:square;mso-width-percent:0;mso-height-percent:0;mso-wrap-distance-left:9pt;mso-wrap-distance-top:0;mso-wrap-distance-right:9pt;mso-wrap-distance-bottom:0;mso-position-horizontal:absolute;mso-position-horizontal-relative:margin;mso-position-vertical:absolute;mso-position-vertical-relative:text;mso-width-percent:0;mso-height-percent:0;mso-width-relative:margin;mso-height-relative:margin;v-text-anchor:middle" o:gfxdata="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" fillcolor="yellow" strokecolor="#e00" strokeweight="2.25pt">
+              <v:rect w14:anchorId="567504E8" id="_x0000_s1036" style="position:absolute;left:0;text-align:left;margin-left:89.25pt;margin-top:24.45pt;width:136.5pt;height:27pt;z-index:251669504;visibility:visible;mso-wrap-style:square;mso-width-percent:0;mso-height-percent:0;mso-wrap-distance-left:9pt;mso-wrap-distance-top:0;mso-wrap-distance-right:9pt;mso-wrap-distance-bottom:0;mso-position-horizontal:absolute;mso-position-horizontal-relative:margin;mso-position-vertical:absolute;mso-position-vertical-relative:text;mso-width-percent:0;mso-height-percent:0;mso-width-relative:margin;mso-height-relative:margin;v-text-anchor:middle" o:gfxdata="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" fillcolor="yellow" strokecolor="#e00" strokeweight="2.25pt">
                 <v:fill opacity="21074f"/>
                 <v:textbox>
                   <w:txbxContent>
@@ -8383,13 +8466,13 @@
         <mc:AlternateContent>
           <mc:Choice Requires="wps">
             <w:drawing>
-              <wp:anchor distT="0" distB="0" distL="114300" distR="114300" simplePos="0" relativeHeight="251667456" behindDoc="0" locked="0" layoutInCell="1" allowOverlap="1" wp14:anchorId="76C98ECC" wp14:editId="05FFBC20">
+              <wp:anchor distT="0" distB="0" distL="114300" distR="114300" simplePos="0" relativeHeight="251667456" behindDoc="0" locked="0" layoutInCell="1" allowOverlap="1" wp14:anchorId="76C98ECC" wp14:editId="75202CBF">
                 <wp:simplePos x="0" y="0"/>
                 <wp:positionH relativeFrom="margin">
                   <wp:align>left</wp:align>
                 </wp:positionH>
                 <wp:positionV relativeFrom="paragraph">
-                  <wp:posOffset>154305</wp:posOffset>
+                  <wp:posOffset>93345</wp:posOffset>
                 </wp:positionV>
                 <wp:extent cx="519430" cy="314960"/>
                 <wp:effectExtent l="19050" t="19050" r="13970" b="27940"/>
@@ -8503,7 +8586,7 @@
           </mc:Choice>
           <mc:Fallback>
             <w:pict>
-              <v:rect w14:anchorId="76C98ECC" id="_x0000_s1037" style="position:absolute;left:0;text-align:left;margin-left:0;margin-top:12.15pt;width:40.9pt;height:24.8pt;z-index:251667456;visibility:visible;mso-wrap-style:square;mso-width-percent:0;mso-height-percent:0;mso-wrap-distance-left:9pt;mso-wrap-distance-top:0;mso-wrap-distance-right:9pt;mso-wrap-distance-bottom:0;mso-position-horizontal:left;mso-position-horizontal-relative:margin;mso-position-vertical:absolute;mso-position-vertical-relative:text;mso-width-percent:0;mso-height-percent:0;mso-width-relative:margin;mso-height-relative:margin;v-text-anchor:middle" o:gfxdata="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" fillcolor="yellow" strokecolor="#e00" strokeweight="2.25pt">
+              <v:rect w14:anchorId="76C98ECC" id="_x0000_s1037" style="position:absolute;left:0;text-align:left;margin-left:0;margin-top:7.35pt;width:40.9pt;height:24.8pt;z-index:251667456;visibility:visible;mso-wrap-style:square;mso-width-percent:0;mso-height-percent:0;mso-wrap-distance-left:9pt;mso-wrap-distance-top:0;mso-wrap-distance-right:9pt;mso-wrap-distance-bottom:0;mso-position-horizontal:left;mso-position-horizontal-relative:margin;mso-position-vertical:absolute;mso-position-vertical-relative:text;mso-width-percent:0;mso-height-percent:0;mso-width-relative:margin;mso-height-relative:margin;v-text-anchor:middle" o:gfxdata="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" fillcolor="yellow" strokecolor="#e00" strokeweight="2.25pt">
                 <v:fill opacity="21074f"/>
                 <v:textbox>
                   <w:txbxContent>
@@ -8560,11 +8643,14 @@
         </mc:AlternateContent>
       </w:r>
       <w:r>
+        <w:rPr>
+          <w:noProof/>
+        </w:rPr>
         <w:drawing>
-          <wp:inline distT="0" distB="0" distL="0" distR="0" wp14:anchorId="34E87F32" wp14:editId="3D58FFF2">
-            <wp:extent cx="5588596" cy="2261870"/>
-            <wp:effectExtent l="19050" t="19050" r="12700" b="24130"/>
-            <wp:docPr id="1148658846" name="Imagen 1"/>
+          <wp:inline distT="0" distB="0" distL="0" distR="0" wp14:anchorId="6424363D" wp14:editId="26A45518">
+            <wp:extent cx="5612130" cy="3827145"/>
+            <wp:effectExtent l="19050" t="19050" r="26670" b="20955"/>
+            <wp:docPr id="199200442" name="Imagen 1"/>
             <wp:cNvGraphicFramePr>
               <a:graphicFrameLocks xmlns:a="http://schemas.openxmlformats.org/drawingml/2006/main" noChangeAspect="1"/>
             </wp:cNvGraphicFramePr>
@@ -8572,7 +8658,7 @@
               <a:graphicData uri="http://schemas.openxmlformats.org/drawingml/2006/picture">
                 <pic:pic xmlns:pic="http://schemas.openxmlformats.org/drawingml/2006/picture">
                   <pic:nvPicPr>
-                    <pic:cNvPr id="1148658846" name=""/>
+                    <pic:cNvPr id="199200442" name=""/>
                     <pic:cNvPicPr/>
                   </pic:nvPicPr>
                   <pic:blipFill>
@@ -8584,7 +8670,7 @@
                   <pic:spPr>
                     <a:xfrm>
                       <a:off x="0" y="0"/>
-                      <a:ext cx="5595263" cy="2264568"/>
+                      <a:ext cx="5612130" cy="3827145"/>
                     </a:xfrm>
                     <a:prstGeom prst="rect">
                       <a:avLst/>
@@ -8674,7 +8760,7 @@
           <w:rPr>
             <w:rStyle w:val="Hipervnculo"/>
           </w:rPr>
-          <w:t>http://localhost:3000/login</w:t>
+          <w:t>http://localhost:3000/auth/login</w:t>
         </w:r>
       </w:hyperlink>
     </w:p>
@@ -8688,6 +8774,7 @@
         <w:jc w:val="both"/>
       </w:pPr>
       <w:r>
+        <w:lastRenderedPageBreak/>
         <w:t>Seleccionamos “POST”, por que es para enviar datos al servidor, no es una consulta, este es el método estándar de autenticación.</w:t>
       </w:r>
     </w:p>
@@ -8760,20 +8847,19 @@
       <w:r>
         <w:t xml:space="preserve">Pegamos nuestro inicio de sesión, como si lo hubiéramos realizado en una </w:t>
       </w:r>
-      <w:proofErr w:type="spellStart"/>
-      <w:r>
-        <w:t>pagina</w:t>
-      </w:r>
-      <w:proofErr w:type="spellEnd"/>
+      <w:r>
+        <w:t>página</w:t>
+      </w:r>
       <w:r>
         <w:t xml:space="preserve"> “usuario”: “</w:t>
       </w:r>
-      <w:proofErr w:type="spellStart"/>
+      <w:r>
+        <w:t>usuario</w:t>
+      </w:r>
       <w:proofErr w:type="gramStart"/>
       <w:r>
-        <w:t>admin</w:t>
-      </w:r>
-      <w:proofErr w:type="spellEnd"/>
+        <w:t>1</w:t>
+      </w:r>
       <w:r>
         <w:t>”/</w:t>
       </w:r>
@@ -8802,16 +8888,24 @@
         <w:jc w:val="both"/>
       </w:pPr>
       <w:r>
-        <w:lastRenderedPageBreak/>
         <w:t xml:space="preserve">Finalmente podemos observar </w:t>
       </w:r>
-      <w:proofErr w:type="spellStart"/>
-      <w:r>
-        <w:t>como</w:t>
-      </w:r>
-      <w:proofErr w:type="spellEnd"/>
-      <w:r>
-        <w:t xml:space="preserve"> nuestro servidor, verifico nuestro usuario, vio que era valido y nos sale el mensaje de “Login correcto”.</w:t>
+      <w:r>
+        <w:t>cómo</w:t>
+      </w:r>
+      <w:r>
+        <w:t xml:space="preserve"> nuestro servidor, verifico nuestro usuario, vio que era valido y nos sale el mensaje de “</w:t>
+      </w:r>
+      <w:proofErr w:type="spellStart"/>
+      <w:r>
+        <w:t>Logín</w:t>
+      </w:r>
+      <w:proofErr w:type="spellEnd"/>
+      <w:r>
+        <w:t xml:space="preserve"> exitoso</w:t>
+      </w:r>
+      <w:r>
+        <w:t>”.</w:t>
       </w:r>
     </w:p>
     <w:p>
@@ -8830,31 +8924,773 @@
       <w:pPr>
         <w:jc w:val="both"/>
       </w:pPr>
-    </w:p>
-    <w:p>
-      <w:pPr>
+      <w:r>
+        <w:rPr>
+          <w:b/>
+          <w:bCs/>
+        </w:rPr>
+        <w:t>Para la 2da.</w:t>
+      </w:r>
+      <w:r>
+        <w:t xml:space="preserve"> </w:t>
+      </w:r>
+      <w:r>
+        <w:rPr>
+          <w:b/>
+          <w:bCs/>
+        </w:rPr>
+        <w:t>Prueba</w:t>
+      </w:r>
+      <w:r>
+        <w:t xml:space="preserve"> ya hemos iniciado sesión como usuario1, por lo </w:t>
+      </w:r>
+      <w:r>
+        <w:t>tanto,</w:t>
+      </w:r>
+      <w:r>
+        <w:t xml:space="preserve"> tratamos de accedes a la pagina que se encuentra en /api/viajes.</w:t>
+      </w:r>
+    </w:p>
+    <w:p>
+      <w:pPr>
+        <w:keepNext/>
         <w:jc w:val="both"/>
       </w:pPr>
-    </w:p>
-    <w:p>
-      <w:pPr>
+      <w:r>
+        <w:rPr>
+          <w:noProof/>
+          <w:highlight w:val="cyan"/>
+          <w:lang w:val="es-CL"/>
+        </w:rPr>
+        <mc:AlternateContent>
+          <mc:Choice Requires="wps">
+            <w:drawing>
+              <wp:anchor distT="0" distB="0" distL="114300" distR="114300" simplePos="0" relativeHeight="251687936" behindDoc="0" locked="0" layoutInCell="1" allowOverlap="1" wp14:anchorId="0D860CF6" wp14:editId="105C8BEF">
+                <wp:simplePos x="0" y="0"/>
+                <wp:positionH relativeFrom="margin">
+                  <wp:posOffset>328718</wp:posOffset>
+                </wp:positionH>
+                <wp:positionV relativeFrom="paragraph">
+                  <wp:posOffset>2249170</wp:posOffset>
+                </wp:positionV>
+                <wp:extent cx="3513365" cy="2130879"/>
+                <wp:effectExtent l="19050" t="19050" r="11430" b="22225"/>
+                <wp:wrapNone/>
+                <wp:docPr id="1399872759" name="Rectángulo 1"/>
+                <wp:cNvGraphicFramePr/>
+                <a:graphic xmlns:a="http://schemas.openxmlformats.org/drawingml/2006/main">
+                  <a:graphicData uri="http://schemas.microsoft.com/office/word/2010/wordprocessingShape">
+                    <wps:wsp>
+                      <wps:cNvSpPr/>
+                      <wps:spPr>
+                        <a:xfrm>
+                          <a:off x="0" y="0"/>
+                          <a:ext cx="3513365" cy="2130879"/>
+                        </a:xfrm>
+                        <a:prstGeom prst="rect">
+                          <a:avLst/>
+                        </a:prstGeom>
+                        <a:solidFill>
+                          <a:srgbClr val="FFFF00">
+                            <a:alpha val="32000"/>
+                          </a:srgbClr>
+                        </a:solidFill>
+                        <a:ln w="28575">
+                          <a:solidFill>
+                            <a:srgbClr val="EE0000"/>
+                          </a:solidFill>
+                        </a:ln>
+                      </wps:spPr>
+                      <wps:style>
+                        <a:lnRef idx="2">
+                          <a:schemeClr val="accent1">
+                            <a:shade val="15000"/>
+                          </a:schemeClr>
+                        </a:lnRef>
+                        <a:fillRef idx="1">
+                          <a:schemeClr val="accent1"/>
+                        </a:fillRef>
+                        <a:effectRef idx="0">
+                          <a:schemeClr val="accent1"/>
+                        </a:effectRef>
+                        <a:fontRef idx="minor">
+                          <a:schemeClr val="lt1"/>
+                        </a:fontRef>
+                      </wps:style>
+                      <wps:txbx>
+                        <w:txbxContent>
+                          <w:p>
+                            <w:pPr>
+                              <w:jc w:val="right"/>
+                              <w:rPr>
+                                <w:b/>
+                                <w:bCs/>
+                                <w:color w:val="000000" w:themeColor="text1"/>
+                                <w:sz w:val="32"/>
+                                <w:szCs w:val="32"/>
+                                <w:lang w:val="es-CL"/>
+                                <w14:shadow w14:blurRad="38100" w14:dist="19050" w14:dir="2700000" w14:sx="100000" w14:sy="100000" w14:kx="0" w14:ky="0" w14:algn="tl">
+                                  <w14:schemeClr w14:val="dk1">
+                                    <w14:alpha w14:val="60000"/>
+                                  </w14:schemeClr>
+                                </w14:shadow>
+                                <w14:textOutline w14:w="0" w14:cap="flat" w14:cmpd="sng" w14:algn="ctr">
+                                  <w14:noFill/>
+                                  <w14:prstDash w14:val="solid"/>
+                                  <w14:round/>
+                                </w14:textOutline>
+                              </w:rPr>
+                            </w:pPr>
+                            <w:r>
+                              <w:rPr>
+                                <w:b/>
+                                <w:bCs/>
+                                <w:color w:val="000000" w:themeColor="text1"/>
+                                <w:sz w:val="32"/>
+                                <w:szCs w:val="32"/>
+                                <w:lang w:val="es-CL"/>
+                                <w14:shadow w14:blurRad="38100" w14:dist="19050" w14:dir="2700000" w14:sx="100000" w14:sy="100000" w14:kx="0" w14:ky="0" w14:algn="tl">
+                                  <w14:schemeClr w14:val="dk1">
+                                    <w14:alpha w14:val="60000"/>
+                                  </w14:schemeClr>
+                                </w14:shadow>
+                                <w14:textOutline w14:w="0" w14:cap="flat" w14:cmpd="sng" w14:algn="ctr">
+                                  <w14:noFill/>
+                                  <w14:prstDash w14:val="solid"/>
+                                  <w14:round/>
+                                </w14:textOutline>
+                              </w:rPr>
+                              <w:t>3</w:t>
+                            </w:r>
+                          </w:p>
+                        </w:txbxContent>
+                      </wps:txbx>
+                      <wps:bodyPr rot="0" spcFirstLastPara="0" vertOverflow="overflow" horzOverflow="overflow" vert="horz" wrap="square" lIns="91440" tIns="45720" rIns="91440" bIns="45720" numCol="1" spcCol="0" rtlCol="0" fromWordArt="0" anchor="ctr" anchorCtr="0" forceAA="0" compatLnSpc="1">
+                        <a:prstTxWarp prst="textNoShape">
+                          <a:avLst/>
+                        </a:prstTxWarp>
+                        <a:noAutofit/>
+                      </wps:bodyPr>
+                    </wps:wsp>
+                  </a:graphicData>
+                </a:graphic>
+                <wp14:sizeRelH relativeFrom="margin">
+                  <wp14:pctWidth>0</wp14:pctWidth>
+                </wp14:sizeRelH>
+                <wp14:sizeRelV relativeFrom="margin">
+                  <wp14:pctHeight>0</wp14:pctHeight>
+                </wp14:sizeRelV>
+              </wp:anchor>
+            </w:drawing>
+          </mc:Choice>
+          <mc:Fallback>
+            <w:pict>
+              <v:rect w14:anchorId="0D860CF6" id="_x0000_s1038" style="position:absolute;left:0;text-align:left;margin-left:25.9pt;margin-top:177.1pt;width:276.65pt;height:167.8pt;z-index:251687936;visibility:visible;mso-wrap-style:square;mso-width-percent:0;mso-height-percent:0;mso-wrap-distance-left:9pt;mso-wrap-distance-top:0;mso-wrap-distance-right:9pt;mso-wrap-distance-bottom:0;mso-position-horizontal:absolute;mso-position-horizontal-relative:margin;mso-position-vertical:absolute;mso-position-vertical-relative:text;mso-width-percent:0;mso-height-percent:0;mso-width-relative:margin;mso-height-relative:margin;v-text-anchor:middle" o:gfxdata="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" fillcolor="yellow" strokecolor="#e00" strokeweight="2.25pt">
+                <v:fill opacity="21074f"/>
+                <v:textbox>
+                  <w:txbxContent>
+                    <w:p>
+                      <w:pPr>
+                        <w:jc w:val="right"/>
+                        <w:rPr>
+                          <w:b/>
+                          <w:bCs/>
+                          <w:color w:val="000000" w:themeColor="text1"/>
+                          <w:sz w:val="32"/>
+                          <w:szCs w:val="32"/>
+                          <w:lang w:val="es-CL"/>
+                          <w14:shadow w14:blurRad="38100" w14:dist="19050" w14:dir="2700000" w14:sx="100000" w14:sy="100000" w14:kx="0" w14:ky="0" w14:algn="tl">
+                            <w14:schemeClr w14:val="dk1">
+                              <w14:alpha w14:val="60000"/>
+                            </w14:schemeClr>
+                          </w14:shadow>
+                          <w14:textOutline w14:w="0" w14:cap="flat" w14:cmpd="sng" w14:algn="ctr">
+                            <w14:noFill/>
+                            <w14:prstDash w14:val="solid"/>
+                            <w14:round/>
+                          </w14:textOutline>
+                        </w:rPr>
+                      </w:pPr>
+                      <w:r>
+                        <w:rPr>
+                          <w:b/>
+                          <w:bCs/>
+                          <w:color w:val="000000" w:themeColor="text1"/>
+                          <w:sz w:val="32"/>
+                          <w:szCs w:val="32"/>
+                          <w:lang w:val="es-CL"/>
+                          <w14:shadow w14:blurRad="38100" w14:dist="19050" w14:dir="2700000" w14:sx="100000" w14:sy="100000" w14:kx="0" w14:ky="0" w14:algn="tl">
+                            <w14:schemeClr w14:val="dk1">
+                              <w14:alpha w14:val="60000"/>
+                            </w14:schemeClr>
+                          </w14:shadow>
+                          <w14:textOutline w14:w="0" w14:cap="flat" w14:cmpd="sng" w14:algn="ctr">
+                            <w14:noFill/>
+                            <w14:prstDash w14:val="solid"/>
+                            <w14:round/>
+                          </w14:textOutline>
+                        </w:rPr>
+                        <w:t>3</w:t>
+                      </w:r>
+                    </w:p>
+                  </w:txbxContent>
+                </v:textbox>
+                <w10:wrap anchorx="margin"/>
+              </v:rect>
+            </w:pict>
+          </mc:Fallback>
+        </mc:AlternateContent>
+      </w:r>
+      <w:r>
+        <w:rPr>
+          <w:noProof/>
+          <w:highlight w:val="cyan"/>
+          <w:lang w:val="es-CL"/>
+        </w:rPr>
+        <mc:AlternateContent>
+          <mc:Choice Requires="wps">
+            <w:drawing>
+              <wp:anchor distT="0" distB="0" distL="114300" distR="114300" simplePos="0" relativeHeight="251683840" behindDoc="0" locked="0" layoutInCell="1" allowOverlap="1" wp14:anchorId="6024F394" wp14:editId="03656371">
+                <wp:simplePos x="0" y="0"/>
+                <wp:positionH relativeFrom="margin">
+                  <wp:posOffset>1268095</wp:posOffset>
+                </wp:positionH>
+                <wp:positionV relativeFrom="paragraph">
+                  <wp:posOffset>519430</wp:posOffset>
+                </wp:positionV>
+                <wp:extent cx="2484664" cy="326571"/>
+                <wp:effectExtent l="19050" t="19050" r="11430" b="16510"/>
+                <wp:wrapNone/>
+                <wp:docPr id="1713458285" name="Rectángulo 1"/>
+                <wp:cNvGraphicFramePr/>
+                <a:graphic xmlns:a="http://schemas.openxmlformats.org/drawingml/2006/main">
+                  <a:graphicData uri="http://schemas.microsoft.com/office/word/2010/wordprocessingShape">
+                    <wps:wsp>
+                      <wps:cNvSpPr/>
+                      <wps:spPr>
+                        <a:xfrm>
+                          <a:off x="0" y="0"/>
+                          <a:ext cx="2484664" cy="326571"/>
+                        </a:xfrm>
+                        <a:prstGeom prst="rect">
+                          <a:avLst/>
+                        </a:prstGeom>
+                        <a:solidFill>
+                          <a:srgbClr val="FFFF00">
+                            <a:alpha val="32000"/>
+                          </a:srgbClr>
+                        </a:solidFill>
+                        <a:ln w="28575">
+                          <a:solidFill>
+                            <a:srgbClr val="EE0000"/>
+                          </a:solidFill>
+                        </a:ln>
+                      </wps:spPr>
+                      <wps:style>
+                        <a:lnRef idx="2">
+                          <a:schemeClr val="accent1">
+                            <a:shade val="15000"/>
+                          </a:schemeClr>
+                        </a:lnRef>
+                        <a:fillRef idx="1">
+                          <a:schemeClr val="accent1"/>
+                        </a:fillRef>
+                        <a:effectRef idx="0">
+                          <a:schemeClr val="accent1"/>
+                        </a:effectRef>
+                        <a:fontRef idx="minor">
+                          <a:schemeClr val="lt1"/>
+                        </a:fontRef>
+                      </wps:style>
+                      <wps:txbx>
+                        <w:txbxContent>
+                          <w:p>
+                            <w:pPr>
+                              <w:jc w:val="right"/>
+                              <w:rPr>
+                                <w:b/>
+                                <w:bCs/>
+                                <w:color w:val="000000" w:themeColor="text1"/>
+                                <w:sz w:val="32"/>
+                                <w:szCs w:val="32"/>
+                                <w:lang w:val="es-CL"/>
+                                <w14:shadow w14:blurRad="38100" w14:dist="19050" w14:dir="2700000" w14:sx="100000" w14:sy="100000" w14:kx="0" w14:ky="0" w14:algn="tl">
+                                  <w14:schemeClr w14:val="dk1">
+                                    <w14:alpha w14:val="60000"/>
+                                  </w14:schemeClr>
+                                </w14:shadow>
+                                <w14:textOutline w14:w="0" w14:cap="flat" w14:cmpd="sng" w14:algn="ctr">
+                                  <w14:noFill/>
+                                  <w14:prstDash w14:val="solid"/>
+                                  <w14:round/>
+                                </w14:textOutline>
+                              </w:rPr>
+                            </w:pPr>
+                            <w:r>
+                              <w:rPr>
+                                <w:b/>
+                                <w:bCs/>
+                                <w:color w:val="000000" w:themeColor="text1"/>
+                                <w:sz w:val="32"/>
+                                <w:szCs w:val="32"/>
+                                <w:lang w:val="es-CL"/>
+                                <w14:shadow w14:blurRad="38100" w14:dist="19050" w14:dir="2700000" w14:sx="100000" w14:sy="100000" w14:kx="0" w14:ky="0" w14:algn="tl">
+                                  <w14:schemeClr w14:val="dk1">
+                                    <w14:alpha w14:val="60000"/>
+                                  </w14:schemeClr>
+                                </w14:shadow>
+                                <w14:textOutline w14:w="0" w14:cap="flat" w14:cmpd="sng" w14:algn="ctr">
+                                  <w14:noFill/>
+                                  <w14:prstDash w14:val="solid"/>
+                                  <w14:round/>
+                                </w14:textOutline>
+                              </w:rPr>
+                              <w:t>2</w:t>
+                            </w:r>
+                          </w:p>
+                        </w:txbxContent>
+                      </wps:txbx>
+                      <wps:bodyPr rot="0" spcFirstLastPara="0" vertOverflow="overflow" horzOverflow="overflow" vert="horz" wrap="square" lIns="91440" tIns="45720" rIns="91440" bIns="45720" numCol="1" spcCol="0" rtlCol="0" fromWordArt="0" anchor="ctr" anchorCtr="0" forceAA="0" compatLnSpc="1">
+                        <a:prstTxWarp prst="textNoShape">
+                          <a:avLst/>
+                        </a:prstTxWarp>
+                        <a:noAutofit/>
+                      </wps:bodyPr>
+                    </wps:wsp>
+                  </a:graphicData>
+                </a:graphic>
+                <wp14:sizeRelH relativeFrom="margin">
+                  <wp14:pctWidth>0</wp14:pctWidth>
+                </wp14:sizeRelH>
+                <wp14:sizeRelV relativeFrom="margin">
+                  <wp14:pctHeight>0</wp14:pctHeight>
+                </wp14:sizeRelV>
+              </wp:anchor>
+            </w:drawing>
+          </mc:Choice>
+          <mc:Fallback>
+            <w:pict>
+              <v:rect w14:anchorId="6024F394" id="_x0000_s1039" style="position:absolute;left:0;text-align:left;margin-left:99.85pt;margin-top:40.9pt;width:195.65pt;height:25.7pt;z-index:251683840;visibility:visible;mso-wrap-style:square;mso-width-percent:0;mso-height-percent:0;mso-wrap-distance-left:9pt;mso-wrap-distance-top:0;mso-wrap-distance-right:9pt;mso-wrap-distance-bottom:0;mso-position-horizontal:absolute;mso-position-horizontal-relative:margin;mso-position-vertical:absolute;mso-position-vertical-relative:text;mso-width-percent:0;mso-height-percent:0;mso-width-relative:margin;mso-height-relative:margin;v-text-anchor:middle" o:gfxdata="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" fillcolor="yellow" strokecolor="#e00" strokeweight="2.25pt">
+                <v:fill opacity="21074f"/>
+                <v:textbox>
+                  <w:txbxContent>
+                    <w:p>
+                      <w:pPr>
+                        <w:jc w:val="right"/>
+                        <w:rPr>
+                          <w:b/>
+                          <w:bCs/>
+                          <w:color w:val="000000" w:themeColor="text1"/>
+                          <w:sz w:val="32"/>
+                          <w:szCs w:val="32"/>
+                          <w:lang w:val="es-CL"/>
+                          <w14:shadow w14:blurRad="38100" w14:dist="19050" w14:dir="2700000" w14:sx="100000" w14:sy="100000" w14:kx="0" w14:ky="0" w14:algn="tl">
+                            <w14:schemeClr w14:val="dk1">
+                              <w14:alpha w14:val="60000"/>
+                            </w14:schemeClr>
+                          </w14:shadow>
+                          <w14:textOutline w14:w="0" w14:cap="flat" w14:cmpd="sng" w14:algn="ctr">
+                            <w14:noFill/>
+                            <w14:prstDash w14:val="solid"/>
+                            <w14:round/>
+                          </w14:textOutline>
+                        </w:rPr>
+                      </w:pPr>
+                      <w:r>
+                        <w:rPr>
+                          <w:b/>
+                          <w:bCs/>
+                          <w:color w:val="000000" w:themeColor="text1"/>
+                          <w:sz w:val="32"/>
+                          <w:szCs w:val="32"/>
+                          <w:lang w:val="es-CL"/>
+                          <w14:shadow w14:blurRad="38100" w14:dist="19050" w14:dir="2700000" w14:sx="100000" w14:sy="100000" w14:kx="0" w14:ky="0" w14:algn="tl">
+                            <w14:schemeClr w14:val="dk1">
+                              <w14:alpha w14:val="60000"/>
+                            </w14:schemeClr>
+                          </w14:shadow>
+                          <w14:textOutline w14:w="0" w14:cap="flat" w14:cmpd="sng" w14:algn="ctr">
+                            <w14:noFill/>
+                            <w14:prstDash w14:val="solid"/>
+                            <w14:round/>
+                          </w14:textOutline>
+                        </w:rPr>
+                        <w:t>2</w:t>
+                      </w:r>
+                    </w:p>
+                  </w:txbxContent>
+                </v:textbox>
+                <w10:wrap anchorx="margin"/>
+              </v:rect>
+            </w:pict>
+          </mc:Fallback>
+        </mc:AlternateContent>
+      </w:r>
+      <w:r>
+        <w:rPr>
+          <w:noProof/>
+          <w:highlight w:val="cyan"/>
+          <w:lang w:val="es-CL"/>
+        </w:rPr>
+        <mc:AlternateContent>
+          <mc:Choice Requires="wps">
+            <w:drawing>
+              <wp:anchor distT="0" distB="0" distL="114300" distR="114300" simplePos="0" relativeHeight="251685888" behindDoc="0" locked="0" layoutInCell="1" allowOverlap="1" wp14:anchorId="3AA25AE9" wp14:editId="185A0366">
+                <wp:simplePos x="0" y="0"/>
+                <wp:positionH relativeFrom="margin">
+                  <wp:posOffset>163195</wp:posOffset>
+                </wp:positionH>
+                <wp:positionV relativeFrom="paragraph">
+                  <wp:posOffset>560917</wp:posOffset>
+                </wp:positionV>
+                <wp:extent cx="884464" cy="326571"/>
+                <wp:effectExtent l="19050" t="19050" r="11430" b="16510"/>
+                <wp:wrapNone/>
+                <wp:docPr id="1581348252" name="Rectángulo 1"/>
+                <wp:cNvGraphicFramePr/>
+                <a:graphic xmlns:a="http://schemas.openxmlformats.org/drawingml/2006/main">
+                  <a:graphicData uri="http://schemas.microsoft.com/office/word/2010/wordprocessingShape">
+                    <wps:wsp>
+                      <wps:cNvSpPr/>
+                      <wps:spPr>
+                        <a:xfrm>
+                          <a:off x="0" y="0"/>
+                          <a:ext cx="884464" cy="326571"/>
+                        </a:xfrm>
+                        <a:prstGeom prst="rect">
+                          <a:avLst/>
+                        </a:prstGeom>
+                        <a:solidFill>
+                          <a:srgbClr val="FFFF00">
+                            <a:alpha val="32000"/>
+                          </a:srgbClr>
+                        </a:solidFill>
+                        <a:ln w="28575">
+                          <a:solidFill>
+                            <a:srgbClr val="EE0000"/>
+                          </a:solidFill>
+                        </a:ln>
+                      </wps:spPr>
+                      <wps:style>
+                        <a:lnRef idx="2">
+                          <a:schemeClr val="accent1">
+                            <a:shade val="15000"/>
+                          </a:schemeClr>
+                        </a:lnRef>
+                        <a:fillRef idx="1">
+                          <a:schemeClr val="accent1"/>
+                        </a:fillRef>
+                        <a:effectRef idx="0">
+                          <a:schemeClr val="accent1"/>
+                        </a:effectRef>
+                        <a:fontRef idx="minor">
+                          <a:schemeClr val="lt1"/>
+                        </a:fontRef>
+                      </wps:style>
+                      <wps:txbx>
+                        <w:txbxContent>
+                          <w:p>
+                            <w:pPr>
+                              <w:jc w:val="right"/>
+                              <w:rPr>
+                                <w:b/>
+                                <w:bCs/>
+                                <w:color w:val="000000" w:themeColor="text1"/>
+                                <w:sz w:val="32"/>
+                                <w:szCs w:val="32"/>
+                                <w:lang w:val="es-CL"/>
+                                <w14:shadow w14:blurRad="38100" w14:dist="19050" w14:dir="2700000" w14:sx="100000" w14:sy="100000" w14:kx="0" w14:ky="0" w14:algn="tl">
+                                  <w14:schemeClr w14:val="dk1">
+                                    <w14:alpha w14:val="60000"/>
+                                  </w14:schemeClr>
+                                </w14:shadow>
+                                <w14:textOutline w14:w="0" w14:cap="flat" w14:cmpd="sng" w14:algn="ctr">
+                                  <w14:noFill/>
+                                  <w14:prstDash w14:val="solid"/>
+                                  <w14:round/>
+                                </w14:textOutline>
+                              </w:rPr>
+                            </w:pPr>
+                            <w:r>
+                              <w:rPr>
+                                <w:b/>
+                                <w:bCs/>
+                                <w:color w:val="000000" w:themeColor="text1"/>
+                                <w:sz w:val="32"/>
+                                <w:szCs w:val="32"/>
+                                <w:lang w:val="es-CL"/>
+                                <w14:shadow w14:blurRad="38100" w14:dist="19050" w14:dir="2700000" w14:sx="100000" w14:sy="100000" w14:kx="0" w14:ky="0" w14:algn="tl">
+                                  <w14:schemeClr w14:val="dk1">
+                                    <w14:alpha w14:val="60000"/>
+                                  </w14:schemeClr>
+                                </w14:shadow>
+                                <w14:textOutline w14:w="0" w14:cap="flat" w14:cmpd="sng" w14:algn="ctr">
+                                  <w14:noFill/>
+                                  <w14:prstDash w14:val="solid"/>
+                                  <w14:round/>
+                                </w14:textOutline>
+                              </w:rPr>
+                              <w:t>1</w:t>
+                            </w:r>
+                          </w:p>
+                        </w:txbxContent>
+                      </wps:txbx>
+                      <wps:bodyPr rot="0" spcFirstLastPara="0" vertOverflow="overflow" horzOverflow="overflow" vert="horz" wrap="square" lIns="91440" tIns="45720" rIns="91440" bIns="45720" numCol="1" spcCol="0" rtlCol="0" fromWordArt="0" anchor="ctr" anchorCtr="0" forceAA="0" compatLnSpc="1">
+                        <a:prstTxWarp prst="textNoShape">
+                          <a:avLst/>
+                        </a:prstTxWarp>
+                        <a:noAutofit/>
+                      </wps:bodyPr>
+                    </wps:wsp>
+                  </a:graphicData>
+                </a:graphic>
+                <wp14:sizeRelH relativeFrom="margin">
+                  <wp14:pctWidth>0</wp14:pctWidth>
+                </wp14:sizeRelH>
+                <wp14:sizeRelV relativeFrom="margin">
+                  <wp14:pctHeight>0</wp14:pctHeight>
+                </wp14:sizeRelV>
+              </wp:anchor>
+            </w:drawing>
+          </mc:Choice>
+          <mc:Fallback>
+            <w:pict>
+              <v:rect w14:anchorId="3AA25AE9" id="_x0000_s1040" style="position:absolute;left:0;text-align:left;margin-left:12.85pt;margin-top:44.15pt;width:69.65pt;height:25.7pt;z-index:251685888;visibility:visible;mso-wrap-style:square;mso-width-percent:0;mso-height-percent:0;mso-wrap-distance-left:9pt;mso-wrap-distance-top:0;mso-wrap-distance-right:9pt;mso-wrap-distance-bottom:0;mso-position-horizontal:absolute;mso-position-horizontal-relative:margin;mso-position-vertical:absolute;mso-position-vertical-relative:text;mso-width-percent:0;mso-height-percent:0;mso-width-relative:margin;mso-height-relative:margin;v-text-anchor:middle" o:gfxdata="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" fillcolor="yellow" strokecolor="#e00" strokeweight="2.25pt">
+                <v:fill opacity="21074f"/>
+                <v:textbox>
+                  <w:txbxContent>
+                    <w:p>
+                      <w:pPr>
+                        <w:jc w:val="right"/>
+                        <w:rPr>
+                          <w:b/>
+                          <w:bCs/>
+                          <w:color w:val="000000" w:themeColor="text1"/>
+                          <w:sz w:val="32"/>
+                          <w:szCs w:val="32"/>
+                          <w:lang w:val="es-CL"/>
+                          <w14:shadow w14:blurRad="38100" w14:dist="19050" w14:dir="2700000" w14:sx="100000" w14:sy="100000" w14:kx="0" w14:ky="0" w14:algn="tl">
+                            <w14:schemeClr w14:val="dk1">
+                              <w14:alpha w14:val="60000"/>
+                            </w14:schemeClr>
+                          </w14:shadow>
+                          <w14:textOutline w14:w="0" w14:cap="flat" w14:cmpd="sng" w14:algn="ctr">
+                            <w14:noFill/>
+                            <w14:prstDash w14:val="solid"/>
+                            <w14:round/>
+                          </w14:textOutline>
+                        </w:rPr>
+                      </w:pPr>
+                      <w:r>
+                        <w:rPr>
+                          <w:b/>
+                          <w:bCs/>
+                          <w:color w:val="000000" w:themeColor="text1"/>
+                          <w:sz w:val="32"/>
+                          <w:szCs w:val="32"/>
+                          <w:lang w:val="es-CL"/>
+                          <w14:shadow w14:blurRad="38100" w14:dist="19050" w14:dir="2700000" w14:sx="100000" w14:sy="100000" w14:kx="0" w14:ky="0" w14:algn="tl">
+                            <w14:schemeClr w14:val="dk1">
+                              <w14:alpha w14:val="60000"/>
+                            </w14:schemeClr>
+                          </w14:shadow>
+                          <w14:textOutline w14:w="0" w14:cap="flat" w14:cmpd="sng" w14:algn="ctr">
+                            <w14:noFill/>
+                            <w14:prstDash w14:val="solid"/>
+                            <w14:round/>
+                          </w14:textOutline>
+                        </w:rPr>
+                        <w:t>1</w:t>
+                      </w:r>
+                    </w:p>
+                  </w:txbxContent>
+                </v:textbox>
+                <w10:wrap anchorx="margin"/>
+              </v:rect>
+            </w:pict>
+          </mc:Fallback>
+        </mc:AlternateContent>
+      </w:r>
+      <w:r>
+        <w:rPr>
+          <w:noProof/>
+        </w:rPr>
+        <w:drawing>
+          <wp:inline distT="0" distB="0" distL="0" distR="0" wp14:anchorId="1407A10A" wp14:editId="19D5941D">
+            <wp:extent cx="5612130" cy="4351020"/>
+            <wp:effectExtent l="19050" t="19050" r="26670" b="11430"/>
+            <wp:docPr id="1620863236" name="Imagen 1"/>
+            <wp:cNvGraphicFramePr>
+              <a:graphicFrameLocks xmlns:a="http://schemas.openxmlformats.org/drawingml/2006/main" noChangeAspect="1"/>
+            </wp:cNvGraphicFramePr>
+            <a:graphic xmlns:a="http://schemas.openxmlformats.org/drawingml/2006/main">
+              <a:graphicData uri="http://schemas.openxmlformats.org/drawingml/2006/picture">
+                <pic:pic xmlns:pic="http://schemas.openxmlformats.org/drawingml/2006/picture">
+                  <pic:nvPicPr>
+                    <pic:cNvPr id="1620863236" name=""/>
+                    <pic:cNvPicPr/>
+                  </pic:nvPicPr>
+                  <pic:blipFill>
+                    <a:blip r:embed="rId11"/>
+                    <a:stretch>
+                      <a:fillRect/>
+                    </a:stretch>
+                  </pic:blipFill>
+                  <pic:spPr>
+                    <a:xfrm>
+                      <a:off x="0" y="0"/>
+                      <a:ext cx="5617241" cy="4354982"/>
+                    </a:xfrm>
+                    <a:prstGeom prst="rect">
+                      <a:avLst/>
+                    </a:prstGeom>
+                    <a:ln>
+                      <a:solidFill>
+                        <a:schemeClr val="tx1"/>
+                      </a:solidFill>
+                    </a:ln>
+                  </pic:spPr>
+                </pic:pic>
+              </a:graphicData>
+            </a:graphic>
+          </wp:inline>
+        </w:drawing>
+      </w:r>
+    </w:p>
+    <w:p>
+      <w:pPr>
+        <w:pStyle w:val="Descripcin"/>
         <w:jc w:val="both"/>
       </w:pPr>
-    </w:p>
-    <w:p>
-      <w:pPr>
+      <w:r>
+        <w:t xml:space="preserve">Ilustración </w:t>
+      </w:r>
+      <w:fldSimple w:instr=" SEQ Ilustración \* ARABIC ">
+        <w:r>
+          <w:rPr>
+            <w:noProof/>
+          </w:rPr>
+          <w:t>4</w:t>
+        </w:r>
+      </w:fldSimple>
+      <w:r>
+        <w:t xml:space="preserve">. Solicitud de ingreso a la </w:t>
+      </w:r>
+      <w:r>
+        <w:t>página</w:t>
+      </w:r>
+      <w:r>
+        <w:t xml:space="preserve"> viajes.</w:t>
+      </w:r>
+    </w:p>
+    <w:p>
+      <w:pPr>
+        <w:spacing w:line="360" w:lineRule="auto"/>
         <w:jc w:val="both"/>
       </w:pPr>
-    </w:p>
-    <w:p>
-      <w:pPr>
+      <w:r>
+        <w:lastRenderedPageBreak/>
+        <w:t xml:space="preserve">En este caso, iniciamos un nuevo protocolo HTTP y ahora seleccionamos “GET” por que es una consulta, luego le indicamos la </w:t>
+      </w:r>
+      <w:r>
+        <w:t>página</w:t>
+      </w:r>
+      <w:r>
+        <w:t xml:space="preserve"> “…3000/api/viajes” y según nuestro código le debe entregar las ciudades y los </w:t>
+      </w:r>
+      <w:r>
+        <w:t>días</w:t>
+      </w:r>
+      <w:r>
+        <w:t xml:space="preserve">, lo cual se muestra como código abajo y es lo correcto, para confirmar que el usuario puede ver esto </w:t>
+      </w:r>
+      <w:proofErr w:type="spellStart"/>
+      <w:r>
+        <w:t>por que</w:t>
+      </w:r>
+      <w:proofErr w:type="spellEnd"/>
+      <w:r>
+        <w:t xml:space="preserve"> esta </w:t>
+      </w:r>
+      <w:proofErr w:type="spellStart"/>
+      <w:r>
+        <w:t>logeado</w:t>
+      </w:r>
+      <w:proofErr w:type="spellEnd"/>
+      <w:r>
+        <w:t xml:space="preserve"> correctamente, veremos las cookies.</w:t>
+      </w:r>
+    </w:p>
+    <w:p>
+      <w:pPr>
+        <w:keepNext/>
         <w:jc w:val="both"/>
       </w:pPr>
-    </w:p>
-    <w:p>
-      <w:pPr>
+      <w:r>
+        <w:rPr>
+          <w:noProof/>
+        </w:rPr>
+        <w:drawing>
+          <wp:inline distT="0" distB="0" distL="0" distR="0" wp14:anchorId="2CCDB339" wp14:editId="211AF903">
+            <wp:extent cx="5612130" cy="574040"/>
+            <wp:effectExtent l="19050" t="19050" r="26670" b="16510"/>
+            <wp:docPr id="1792662353" name="Imagen 1"/>
+            <wp:cNvGraphicFramePr>
+              <a:graphicFrameLocks xmlns:a="http://schemas.openxmlformats.org/drawingml/2006/main" noChangeAspect="1"/>
+            </wp:cNvGraphicFramePr>
+            <a:graphic xmlns:a="http://schemas.openxmlformats.org/drawingml/2006/main">
+              <a:graphicData uri="http://schemas.openxmlformats.org/drawingml/2006/picture">
+                <pic:pic xmlns:pic="http://schemas.openxmlformats.org/drawingml/2006/picture">
+                  <pic:nvPicPr>
+                    <pic:cNvPr id="1792662353" name=""/>
+                    <pic:cNvPicPr/>
+                  </pic:nvPicPr>
+                  <pic:blipFill>
+                    <a:blip r:embed="rId12"/>
+                    <a:stretch>
+                      <a:fillRect/>
+                    </a:stretch>
+                  </pic:blipFill>
+                  <pic:spPr>
+                    <a:xfrm>
+                      <a:off x="0" y="0"/>
+                      <a:ext cx="5612130" cy="574040"/>
+                    </a:xfrm>
+                    <a:prstGeom prst="rect">
+                      <a:avLst/>
+                    </a:prstGeom>
+                    <a:ln>
+                      <a:solidFill>
+                        <a:schemeClr val="tx1"/>
+                      </a:solidFill>
+                    </a:ln>
+                  </pic:spPr>
+                </pic:pic>
+              </a:graphicData>
+            </a:graphic>
+          </wp:inline>
+        </w:drawing>
+      </w:r>
+    </w:p>
+    <w:p>
+      <w:pPr>
+        <w:pStyle w:val="Descripcin"/>
         <w:jc w:val="both"/>
       </w:pPr>
+      <w:r>
+        <w:t xml:space="preserve">Ilustración </w:t>
+      </w:r>
+      <w:fldSimple w:instr=" SEQ Ilustración \* ARABIC ">
+        <w:r>
+          <w:rPr>
+            <w:noProof/>
+          </w:rPr>
+          <w:t>5</w:t>
+        </w:r>
+      </w:fldSimple>
+      <w:r>
+        <w:t>. Cookie guardada con el JWET con el inicio de sesión, llamada “token”.</w:t>
+      </w:r>
     </w:p>
     <w:p>
       <w:pPr>
@@ -8863,18 +9699,45 @@
     </w:p>
     <w:p>
       <w:pPr>
+        <w:spacing w:line="360" w:lineRule="auto"/>
         <w:jc w:val="both"/>
       </w:pPr>
-    </w:p>
-    <w:p>
-      <w:pPr>
+      <w:r>
+        <w:t xml:space="preserve">Con esto demostramos que el proceso del </w:t>
+      </w:r>
+      <w:proofErr w:type="gramStart"/>
+      <w:r>
+        <w:t>middleware,</w:t>
+      </w:r>
+      <w:proofErr w:type="gramEnd"/>
+      <w:r>
+        <w:t xml:space="preserve"> fue verificar la cookie y buscar en “token” decodificar su </w:t>
+      </w:r>
+      <w:r>
+        <w:t>información para autenticar que el usuario tiene permiso para ingresar a esa página.</w:t>
+      </w:r>
+    </w:p>
+    <w:p>
+      <w:pPr>
+        <w:spacing w:line="360" w:lineRule="auto"/>
         <w:jc w:val="both"/>
       </w:pPr>
     </w:p>
     <w:p>
       <w:pPr>
+        <w:spacing w:line="360" w:lineRule="auto"/>
         <w:jc w:val="both"/>
       </w:pPr>
+      <w:r>
+        <w:rPr>
+          <w:b/>
+          <w:bCs/>
+        </w:rPr>
+        <w:t>3ra. Prueba</w:t>
+      </w:r>
+      <w:r>
+        <w:t>, ahora veremos que pasa si este mismo usuario intenta acceder a una pagina que por su rol no tiene autorización de acceso.</w:t>
+      </w:r>
     </w:p>
     <w:p>
       <w:pPr>
@@ -8885,36 +9748,123 @@
       <w:pPr>
         <w:jc w:val="both"/>
       </w:pPr>
-    </w:p>
-    <w:p>
-      <w:pPr>
+      <w:r>
+        <w:rPr>
+          <w:noProof/>
+        </w:rPr>
+        <w:drawing>
+          <wp:inline distT="0" distB="0" distL="0" distR="0" wp14:anchorId="7A2A5CDC" wp14:editId="4D97F376">
+            <wp:extent cx="5612130" cy="2181225"/>
+            <wp:effectExtent l="19050" t="19050" r="26670" b="28575"/>
+            <wp:docPr id="1283298459" name="Imagen 1"/>
+            <wp:cNvGraphicFramePr>
+              <a:graphicFrameLocks xmlns:a="http://schemas.openxmlformats.org/drawingml/2006/main" noChangeAspect="1"/>
+            </wp:cNvGraphicFramePr>
+            <a:graphic xmlns:a="http://schemas.openxmlformats.org/drawingml/2006/main">
+              <a:graphicData uri="http://schemas.openxmlformats.org/drawingml/2006/picture">
+                <pic:pic xmlns:pic="http://schemas.openxmlformats.org/drawingml/2006/picture">
+                  <pic:nvPicPr>
+                    <pic:cNvPr id="1283298459" name=""/>
+                    <pic:cNvPicPr/>
+                  </pic:nvPicPr>
+                  <pic:blipFill>
+                    <a:blip r:embed="rId13"/>
+                    <a:stretch>
+                      <a:fillRect/>
+                    </a:stretch>
+                  </pic:blipFill>
+                  <pic:spPr>
+                    <a:xfrm>
+                      <a:off x="0" y="0"/>
+                      <a:ext cx="5612130" cy="2181225"/>
+                    </a:xfrm>
+                    <a:prstGeom prst="rect">
+                      <a:avLst/>
+                    </a:prstGeom>
+                    <a:ln>
+                      <a:solidFill>
+                        <a:schemeClr val="tx1"/>
+                      </a:solidFill>
+                    </a:ln>
+                  </pic:spPr>
+                </pic:pic>
+              </a:graphicData>
+            </a:graphic>
+          </wp:inline>
+        </w:drawing>
+      </w:r>
+    </w:p>
+    <w:p>
+      <w:pPr>
+        <w:spacing w:line="360" w:lineRule="auto"/>
         <w:jc w:val="both"/>
       </w:pPr>
-    </w:p>
-    <w:p>
-      <w:pPr>
+      <w:r>
+        <w:t xml:space="preserve">Finalmente, en este ejemplo el mismo “usuario1”, intento ingresar a una </w:t>
+      </w:r>
+      <w:r>
+        <w:t>página</w:t>
+      </w:r>
+      <w:r>
+        <w:t xml:space="preserve"> que no </w:t>
+      </w:r>
+      <w:r>
+        <w:t>pertenece</w:t>
+      </w:r>
+      <w:r>
+        <w:t xml:space="preserve"> a su rol, el </w:t>
+      </w:r>
+      <w:r>
+        <w:t>“</w:t>
+      </w:r>
+      <w:proofErr w:type="spellStart"/>
+      <w:r>
+        <w:t>authMiddleware</w:t>
+      </w:r>
+      <w:proofErr w:type="spellEnd"/>
+      <w:r>
+        <w:t xml:space="preserve">” valida la </w:t>
+      </w:r>
+      <w:proofErr w:type="spellStart"/>
+      <w:r>
+        <w:t>autenticacion</w:t>
+      </w:r>
+      <w:proofErr w:type="spellEnd"/>
+      <w:r>
+        <w:t xml:space="preserve"> del token JWT, mientras que “</w:t>
+      </w:r>
+      <w:proofErr w:type="spellStart"/>
+      <w:r>
+        <w:t>roleMiddleware</w:t>
+      </w:r>
+      <w:proofErr w:type="spellEnd"/>
+      <w:r>
+        <w:t xml:space="preserve">” en este caso NO valida el rol </w:t>
+      </w:r>
+      <w:r>
+        <w:t xml:space="preserve">y por tanto deniega el </w:t>
+      </w:r>
+      <w:r>
+        <w:lastRenderedPageBreak/>
+        <w:t>ingreso a la pagina con el mensaje “Acceso denegado. No tiene permisos suficientes”.</w:t>
+      </w:r>
+    </w:p>
+    <w:p>
+      <w:pPr>
+        <w:spacing w:line="360" w:lineRule="auto"/>
         <w:jc w:val="both"/>
       </w:pPr>
-    </w:p>
-    <w:p>
-      <w:pPr>
-        <w:jc w:val="both"/>
-      </w:pPr>
-    </w:p>
-    <w:p>
-      <w:pPr>
-        <w:jc w:val="both"/>
-      </w:pPr>
-    </w:p>
-    <w:p>
-      <w:pPr>
-        <w:jc w:val="both"/>
-      </w:pPr>
-    </w:p>
-    <w:p>
-      <w:pPr>
-        <w:jc w:val="both"/>
-      </w:pPr>
+      <w:r>
+        <w:t xml:space="preserve">Al intentar acceder a una ruta cuyo rol no corresponde, el middleware </w:t>
+      </w:r>
+      <w:proofErr w:type="spellStart"/>
+      <w:r>
+        <w:t>roleMiddleware</w:t>
+      </w:r>
+      <w:proofErr w:type="spellEnd"/>
+      <w:r>
+        <w:t xml:space="preserve"> bloquea el acceso y devuelve un mensaje 403 indicando que el usuario no tiene permisos suficientes.</w:t>
+      </w:r>
     </w:p>
     <w:p>
       <w:pPr>
@@ -8925,9 +9875,17 @@
       <w:pPr>
         <w:pStyle w:val="Ttulo1"/>
         <w:jc w:val="both"/>
-      </w:pPr>
-      <w:bookmarkStart w:id="8" w:name="_Toc227088555"/>
-      <w:r>
+        <w:rPr>
+          <w:b/>
+          <w:bCs/>
+        </w:rPr>
+      </w:pPr>
+      <w:bookmarkStart w:id="8" w:name="_Toc227094324"/>
+      <w:r>
+        <w:rPr>
+          <w:b/>
+          <w:bCs/>
+        </w:rPr>
         <w:t>TRABAJO COLABORATIVO CON GITHUB (AMBOS)</w:t>
       </w:r>
       <w:bookmarkEnd w:id="8"/>
@@ -8938,144 +9896,97 @@
       </w:pPr>
     </w:p>
     <w:p>
+      <w:r>
+        <w:t xml:space="preserve">Esto se encuentra conforme a los </w:t>
+      </w:r>
+      <w:proofErr w:type="spellStart"/>
+      <w:r>
+        <w:t>Commit</w:t>
+      </w:r>
+      <w:proofErr w:type="spellEnd"/>
+      <w:r>
+        <w:t xml:space="preserve"> realizados en </w:t>
+      </w:r>
+      <w:proofErr w:type="spellStart"/>
+      <w:r>
+        <w:t>Github</w:t>
+      </w:r>
+      <w:proofErr w:type="spellEnd"/>
+      <w:r>
+        <w:t xml:space="preserve"> en la pagina</w:t>
+      </w:r>
+    </w:p>
+    <w:p>
+      <w:hyperlink r:id="rId14" w:history="1">
+        <w:proofErr w:type="spellStart"/>
+        <w:r>
+          <w:rPr>
+            <w:rStyle w:val="Hipervnculo"/>
+          </w:rPr>
+          <w:t>MadridDarien</w:t>
+        </w:r>
+        <w:proofErr w:type="spellEnd"/>
+        <w:r>
+          <w:rPr>
+            <w:rStyle w:val="Hipervnculo"/>
+          </w:rPr>
+          <w:t>/taller-plataformas-web-semana4: Trabajo semana 4 Taller de plataformas web</w:t>
+        </w:r>
+      </w:hyperlink>
+    </w:p>
+    <w:p>
+      <w:r>
+        <w:br w:type="page"/>
+      </w:r>
+    </w:p>
+    <w:p>
       <w:pPr>
         <w:jc w:val="both"/>
       </w:pPr>
     </w:p>
     <w:p>
       <w:pPr>
+        <w:pStyle w:val="Ttulo1"/>
+        <w:rPr>
+          <w:b/>
+          <w:bCs/>
+        </w:rPr>
+      </w:pPr>
+      <w:bookmarkStart w:id="9" w:name="_Toc227094325"/>
+      <w:r>
+        <w:rPr>
+          <w:b/>
+          <w:bCs/>
+        </w:rPr>
+        <w:t>CONCLUSIÓN</w:t>
+      </w:r>
+      <w:bookmarkEnd w:id="9"/>
+    </w:p>
+    <w:p/>
+    <w:p>
+      <w:pPr>
+        <w:spacing w:line="360" w:lineRule="auto"/>
         <w:jc w:val="both"/>
       </w:pPr>
-    </w:p>
-    <w:p>
-      <w:pPr>
-        <w:jc w:val="both"/>
-      </w:pPr>
-    </w:p>
-    <w:p>
-      <w:pPr>
-        <w:jc w:val="both"/>
-      </w:pPr>
-    </w:p>
-    <w:p>
-      <w:pPr>
-        <w:jc w:val="both"/>
-      </w:pPr>
-    </w:p>
-    <w:p>
-      <w:pPr>
-        <w:jc w:val="both"/>
-      </w:pPr>
-    </w:p>
-    <w:p>
-      <w:pPr>
-        <w:jc w:val="both"/>
-      </w:pPr>
-    </w:p>
-    <w:p>
-      <w:pPr>
-        <w:jc w:val="both"/>
-      </w:pPr>
-    </w:p>
-    <w:p>
-      <w:pPr>
-        <w:jc w:val="both"/>
-      </w:pPr>
-    </w:p>
-    <w:p>
-      <w:pPr>
-        <w:jc w:val="both"/>
-      </w:pPr>
-    </w:p>
-    <w:p>
-      <w:pPr>
-        <w:jc w:val="both"/>
-      </w:pPr>
-    </w:p>
-    <w:p>
-      <w:pPr>
-        <w:jc w:val="both"/>
-      </w:pPr>
-    </w:p>
-    <w:p>
-      <w:pPr>
-        <w:jc w:val="both"/>
-      </w:pPr>
-    </w:p>
-    <w:p>
-      <w:pPr>
-        <w:jc w:val="both"/>
-      </w:pPr>
-    </w:p>
-    <w:p>
-      <w:pPr>
-        <w:jc w:val="both"/>
-      </w:pPr>
-    </w:p>
-    <w:p>
-      <w:pPr>
-        <w:jc w:val="both"/>
-      </w:pPr>
-    </w:p>
-    <w:p>
-      <w:pPr>
-        <w:jc w:val="both"/>
-      </w:pPr>
-    </w:p>
-    <w:p>
-      <w:pPr>
-        <w:jc w:val="both"/>
-      </w:pPr>
-    </w:p>
-    <w:p>
-      <w:pPr>
-        <w:jc w:val="both"/>
-      </w:pPr>
-    </w:p>
-    <w:p>
-      <w:pPr>
-        <w:jc w:val="both"/>
-      </w:pPr>
-    </w:p>
-    <w:p>
-      <w:pPr>
-        <w:jc w:val="both"/>
-      </w:pPr>
-    </w:p>
-    <w:p>
-      <w:pPr>
-        <w:jc w:val="both"/>
-      </w:pPr>
-    </w:p>
-    <w:p>
-      <w:pPr>
-        <w:jc w:val="both"/>
-      </w:pPr>
-    </w:p>
-    <w:p>
-      <w:pPr>
-        <w:jc w:val="both"/>
-      </w:pPr>
-    </w:p>
-    <w:p>
-      <w:r>
-        <w:br w:type="page"/>
-      </w:r>
-    </w:p>
-    <w:p>
-      <w:pPr>
-        <w:jc w:val="both"/>
-      </w:pPr>
-    </w:p>
-    <w:p>
-      <w:pPr>
-        <w:pStyle w:val="Ttulo1"/>
-      </w:pPr>
-      <w:bookmarkStart w:id="9" w:name="_Toc227088556"/>
-      <w:r>
-        <w:t>CONCLUSIÓN</w:t>
-      </w:r>
-      <w:bookmarkEnd w:id="9"/>
+      <w:r>
+        <w:t xml:space="preserve">En este trabajo se implementó un servidor </w:t>
+      </w:r>
+      <w:proofErr w:type="spellStart"/>
+      <w:r>
+        <w:t>backend</w:t>
+      </w:r>
+      <w:proofErr w:type="spellEnd"/>
+      <w:r>
+        <w:t xml:space="preserve"> utilizando Node.js y Express, incorporando un sistema de autenticación seguro basado en JSON Web Tokens (JWT) y cookies HTTP-</w:t>
+      </w:r>
+      <w:proofErr w:type="spellStart"/>
+      <w:r>
+        <w:t>only</w:t>
+      </w:r>
+      <w:proofErr w:type="spellEnd"/>
+      <w:r>
+        <w:t>. A través del uso de middlewares se logró proteger rutas privadas y restringir el acceso según el rol del usuario, garantizando un control adecuado de autenticación y autorización. Las pruebas realizadas con Postman permitieron validar el correcto funcionamiento del flujo completo: inicio de sesión, verificación del token, acceso a rutas protegidas, restricción por roles y cierre de sesión. Finalmente, el uso de GitHub facilitó el trabajo colaborativo y el control de versiones del proyecto, asegurando una estructura ordenada y profesional.</w:t>
+      </w:r>
     </w:p>
     <w:sectPr>
       <w:pgSz w:w="12240" w:h="15840" w:code="1"/>

</xml_diff>